<commit_message>
refactor(dashboard): centralize chart data fetching in one hook to enable export of data
- Consolidated gauge, gender, and service charts in one hook, in useDashboardCharts.ts
- Updated DashboardSettings to provide chart data to ExportFile
- Passed initial values needed for the export feature (e.g., service, gender, and gauge)
- Changed chart types and dashboard types to accomodate all changes.
- addt'l: For the data table page, hide the rows per page on mobile screens.
</commit_message>
<xml_diff>
--- a/frontend/public/templates/ReportTemplate.docx
+++ b/frontend/public/templates/ReportTemplate.docx
@@ -63,10 +63,7 @@
         <w:t>Filters applied:</w:t>
       </w:r>
       <w:r>
-        <w:t xml:space="preserve"> </w:t>
-      </w:r>
-      <w:r>
-        <w:t>{applied_filters}</w:t>
+        <w:t xml:space="preserve"> July 1, 2025 – December 31, 2025</w:t>
       </w:r>
     </w:p>
     <w:p>
@@ -261,7 +258,7 @@
           <w:i/>
           <w:iCs/>
         </w:rPr>
-        <w:t xml:space="preserve">Total Respondents: </w:t>
+        <w:t>Total Respondents</w:t>
       </w:r>
       <w:r>
         <w:rPr>
@@ -270,7 +267,25 @@
           <w:i/>
           <w:iCs/>
         </w:rPr>
-        <w:t>{totalCount}</w:t>
+        <w:t>: {</w:t>
+      </w:r>
+      <w:r>
+        <w:rPr>
+          <w:b/>
+          <w:bCs/>
+          <w:i/>
+          <w:iCs/>
+        </w:rPr>
+        <w:t>totalCount</w:t>
+      </w:r>
+      <w:r>
+        <w:rPr>
+          <w:b/>
+          <w:bCs/>
+          <w:i/>
+          <w:iCs/>
+        </w:rPr>
+        <w:t>}</w:t>
       </w:r>
     </w:p>
     <w:p>
@@ -284,7 +299,7 @@
         <w:t xml:space="preserve"> </w:t>
       </w:r>
       <w:r>
-        <w:t>{gauge}</w:t>
+        <w:t>{gauge}%</w:t>
       </w:r>
     </w:p>
     <w:p>
@@ -393,6 +408,16 @@
     <w:p>
       <w:r>
         <w:lastRenderedPageBreak/>
+        <w:t>{genderValue}</w:t>
+      </w:r>
+    </w:p>
+    <w:p>
+      <w:r>
+        <w:t>{serviceValue}</w:t>
+      </w:r>
+    </w:p>
+    <w:p>
+      <w:r>
         <w:t>Sentiment By Gender:</w:t>
       </w:r>
     </w:p>
@@ -403,13 +428,13 @@
         <w:tblLook w:val="04A0" w:firstRow="1" w:lastRow="0" w:firstColumn="1" w:lastColumn="0" w:noHBand="0" w:noVBand="1"/>
       </w:tblPr>
       <w:tblGrid>
-        <w:gridCol w:w="1449"/>
-        <w:gridCol w:w="1525"/>
         <w:gridCol w:w="1483"/>
-        <w:gridCol w:w="1458"/>
+        <w:gridCol w:w="1518"/>
+        <w:gridCol w:w="1476"/>
+        <w:gridCol w:w="1450"/>
+        <w:gridCol w:w="1206"/>
         <w:gridCol w:w="1211"/>
-        <w:gridCol w:w="1216"/>
-        <w:gridCol w:w="1008"/>
+        <w:gridCol w:w="1006"/>
       </w:tblGrid>
       <w:tr>
         <w:tc>
@@ -570,7 +595,21 @@
                 <w:sz w:val="18"/>
                 <w:szCs w:val="18"/>
               </w:rPr>
-              <w:t>Male</w:t>
+              <w:t>{gender_name</w:t>
+            </w:r>
+            <w:r>
+              <w:rPr>
+                <w:sz w:val="18"/>
+                <w:szCs w:val="18"/>
+              </w:rPr>
+              <w:t>1</w:t>
+            </w:r>
+            <w:r>
+              <w:rPr>
+                <w:sz w:val="18"/>
+                <w:szCs w:val="18"/>
+              </w:rPr>
+              <w:t>}</w:t>
             </w:r>
           </w:p>
         </w:tc>
@@ -718,7 +757,21 @@
                 <w:sz w:val="18"/>
                 <w:szCs w:val="18"/>
               </w:rPr>
-              <w:t>Female</w:t>
+              <w:t>{gender_name</w:t>
+            </w:r>
+            <w:r>
+              <w:rPr>
+                <w:sz w:val="18"/>
+                <w:szCs w:val="18"/>
+              </w:rPr>
+              <w:t>2</w:t>
+            </w:r>
+            <w:r>
+              <w:rPr>
+                <w:sz w:val="18"/>
+                <w:szCs w:val="18"/>
+              </w:rPr>
+              <w:t>}</w:t>
             </w:r>
           </w:p>
         </w:tc>

</xml_diff>

<commit_message>
Update: Update the Export template placeholders. Add render logic to export file
</commit_message>
<xml_diff>
--- a/frontend/public/templates/ReportTemplate.docx
+++ b/frontend/public/templates/ReportTemplate.docx
@@ -52,7 +52,25 @@
           <w:sz w:val="28"/>
           <w:szCs w:val="28"/>
         </w:rPr>
-        <w:t>{date_now}</w:t>
+        <w:t>{</w:t>
+      </w:r>
+      <w:r>
+        <w:rPr>
+          <w:i/>
+          <w:iCs/>
+          <w:sz w:val="28"/>
+          <w:szCs w:val="28"/>
+        </w:rPr>
+        <w:t>date_now</w:t>
+      </w:r>
+      <w:r>
+        <w:rPr>
+          <w:i/>
+          <w:iCs/>
+          <w:sz w:val="28"/>
+          <w:szCs w:val="28"/>
+        </w:rPr>
+        <w:t>}</w:t>
       </w:r>
     </w:p>
     <w:p>
@@ -63,7 +81,10 @@
         <w:t>Filters applied:</w:t>
       </w:r>
       <w:r>
-        <w:t xml:space="preserve"> July 1, 2025 – December 31, 2025</w:t>
+        <w:t xml:space="preserve"> </w:t>
+      </w:r>
+      <w:r>
+        <w:t>{filters_applied}</w:t>
       </w:r>
     </w:p>
     <w:p>
@@ -428,10 +449,10 @@
         <w:tblLook w:val="04A0" w:firstRow="1" w:lastRow="0" w:firstColumn="1" w:lastColumn="0" w:noHBand="0" w:noVBand="1"/>
       </w:tblPr>
       <w:tblGrid>
-        <w:gridCol w:w="1483"/>
+        <w:gridCol w:w="1482"/>
         <w:gridCol w:w="1518"/>
-        <w:gridCol w:w="1476"/>
-        <w:gridCol w:w="1450"/>
+        <w:gridCol w:w="1475"/>
+        <w:gridCol w:w="1452"/>
         <w:gridCol w:w="1206"/>
         <w:gridCol w:w="1211"/>
         <w:gridCol w:w="1006"/>
@@ -630,7 +651,7 @@
                 <w:sz w:val="18"/>
                 <w:szCs w:val="18"/>
               </w:rPr>
-              <w:t>10</w:t>
+              <w:t>{NegP}%</w:t>
             </w:r>
           </w:p>
         </w:tc>
@@ -651,7 +672,7 @@
                 <w:sz w:val="18"/>
                 <w:szCs w:val="18"/>
               </w:rPr>
-              <w:t>10</w:t>
+              <w:t>{NegC}</w:t>
             </w:r>
           </w:p>
         </w:tc>
@@ -672,7 +693,7 @@
                 <w:sz w:val="18"/>
                 <w:szCs w:val="18"/>
               </w:rPr>
-              <w:t>60</w:t>
+              <w:t>{NeuP}%</w:t>
             </w:r>
           </w:p>
         </w:tc>
@@ -693,7 +714,7 @@
                 <w:sz w:val="18"/>
                 <w:szCs w:val="18"/>
               </w:rPr>
-              <w:t>60</w:t>
+              <w:t>{NeuC}</w:t>
             </w:r>
           </w:p>
         </w:tc>
@@ -714,7 +735,7 @@
                 <w:sz w:val="18"/>
                 <w:szCs w:val="18"/>
               </w:rPr>
-              <w:t>30</w:t>
+              <w:t>{posP}</w:t>
             </w:r>
           </w:p>
         </w:tc>
@@ -735,7 +756,7 @@
                 <w:sz w:val="18"/>
                 <w:szCs w:val="18"/>
               </w:rPr>
-              <w:t>30</w:t>
+              <w:t>{posC}</w:t>
             </w:r>
           </w:p>
         </w:tc>
@@ -792,7 +813,7 @@
                 <w:sz w:val="18"/>
                 <w:szCs w:val="18"/>
               </w:rPr>
-              <w:t>10</w:t>
+              <w:t>{NegP2}%</w:t>
             </w:r>
           </w:p>
         </w:tc>
@@ -813,7 +834,7 @@
                 <w:sz w:val="18"/>
                 <w:szCs w:val="18"/>
               </w:rPr>
-              <w:t>10</w:t>
+              <w:t>{NegC}</w:t>
             </w:r>
           </w:p>
         </w:tc>
@@ -834,7 +855,7 @@
                 <w:sz w:val="18"/>
                 <w:szCs w:val="18"/>
               </w:rPr>
-              <w:t>20</w:t>
+              <w:t>{NeuP2}%</w:t>
             </w:r>
           </w:p>
         </w:tc>
@@ -855,7 +876,7 @@
                 <w:sz w:val="18"/>
                 <w:szCs w:val="18"/>
               </w:rPr>
-              <w:t>20</w:t>
+              <w:t>{NeuC2}</w:t>
             </w:r>
           </w:p>
         </w:tc>
@@ -876,7 +897,7 @@
                 <w:sz w:val="18"/>
                 <w:szCs w:val="18"/>
               </w:rPr>
-              <w:t>70</w:t>
+              <w:t>{posP2}</w:t>
             </w:r>
           </w:p>
         </w:tc>
@@ -897,7 +918,7 @@
                 <w:sz w:val="18"/>
                 <w:szCs w:val="18"/>
               </w:rPr>
-              <w:t>70</w:t>
+              <w:t>{posC2}</w:t>
             </w:r>
           </w:p>
         </w:tc>
@@ -1083,7 +1104,21 @@
                 <w:sz w:val="18"/>
                 <w:szCs w:val="18"/>
               </w:rPr>
-              <w:t>Hybrid Seminars</w:t>
+              <w:t>{</w:t>
+            </w:r>
+            <w:r>
+              <w:rPr>
+                <w:sz w:val="18"/>
+                <w:szCs w:val="18"/>
+              </w:rPr>
+              <w:t>service_name1</w:t>
+            </w:r>
+            <w:r>
+              <w:rPr>
+                <w:sz w:val="18"/>
+                <w:szCs w:val="18"/>
+              </w:rPr>
+              <w:t>}</w:t>
             </w:r>
           </w:p>
         </w:tc>
@@ -1104,7 +1139,7 @@
                 <w:sz w:val="18"/>
                 <w:szCs w:val="18"/>
               </w:rPr>
-              <w:t>10</w:t>
+              <w:t>{sNegP1}%</w:t>
             </w:r>
           </w:p>
         </w:tc>
@@ -1125,7 +1160,21 @@
                 <w:sz w:val="18"/>
                 <w:szCs w:val="18"/>
               </w:rPr>
-              <w:t>10</w:t>
+              <w:t>{sNeg</w:t>
+            </w:r>
+            <w:r>
+              <w:rPr>
+                <w:sz w:val="18"/>
+                <w:szCs w:val="18"/>
+              </w:rPr>
+              <w:t>C</w:t>
+            </w:r>
+            <w:r>
+              <w:rPr>
+                <w:sz w:val="18"/>
+                <w:szCs w:val="18"/>
+              </w:rPr>
+              <w:t>1}</w:t>
             </w:r>
           </w:p>
         </w:tc>
@@ -1146,7 +1195,28 @@
                 <w:sz w:val="18"/>
                 <w:szCs w:val="18"/>
               </w:rPr>
-              <w:t>20</w:t>
+              <w:t>{sNe</w:t>
+            </w:r>
+            <w:r>
+              <w:rPr>
+                <w:sz w:val="18"/>
+                <w:szCs w:val="18"/>
+              </w:rPr>
+              <w:t>uP</w:t>
+            </w:r>
+            <w:r>
+              <w:rPr>
+                <w:sz w:val="18"/>
+                <w:szCs w:val="18"/>
+              </w:rPr>
+              <w:t>1}</w:t>
+            </w:r>
+            <w:r>
+              <w:rPr>
+                <w:sz w:val="18"/>
+                <w:szCs w:val="18"/>
+              </w:rPr>
+              <w:t>%</w:t>
             </w:r>
           </w:p>
         </w:tc>
@@ -1167,7 +1237,21 @@
                 <w:sz w:val="18"/>
                 <w:szCs w:val="18"/>
               </w:rPr>
-              <w:t>20</w:t>
+              <w:t>{sNeu</w:t>
+            </w:r>
+            <w:r>
+              <w:rPr>
+                <w:sz w:val="18"/>
+                <w:szCs w:val="18"/>
+              </w:rPr>
+              <w:t>C</w:t>
+            </w:r>
+            <w:r>
+              <w:rPr>
+                <w:sz w:val="18"/>
+                <w:szCs w:val="18"/>
+              </w:rPr>
+              <w:t>1}</w:t>
             </w:r>
           </w:p>
         </w:tc>
@@ -1188,7 +1272,28 @@
                 <w:sz w:val="18"/>
                 <w:szCs w:val="18"/>
               </w:rPr>
-              <w:t>70</w:t>
+              <w:t>{s</w:t>
+            </w:r>
+            <w:r>
+              <w:rPr>
+                <w:sz w:val="18"/>
+                <w:szCs w:val="18"/>
+              </w:rPr>
+              <w:t>PosP</w:t>
+            </w:r>
+            <w:r>
+              <w:rPr>
+                <w:sz w:val="18"/>
+                <w:szCs w:val="18"/>
+              </w:rPr>
+              <w:t>1}</w:t>
+            </w:r>
+            <w:r>
+              <w:rPr>
+                <w:sz w:val="18"/>
+                <w:szCs w:val="18"/>
+              </w:rPr>
+              <w:t>%</w:t>
             </w:r>
           </w:p>
         </w:tc>
@@ -1209,7 +1314,21 @@
                 <w:sz w:val="18"/>
                 <w:szCs w:val="18"/>
               </w:rPr>
-              <w:t>70</w:t>
+              <w:t>{sPos</w:t>
+            </w:r>
+            <w:r>
+              <w:rPr>
+                <w:sz w:val="18"/>
+                <w:szCs w:val="18"/>
+              </w:rPr>
+              <w:t>C</w:t>
+            </w:r>
+            <w:r>
+              <w:rPr>
+                <w:sz w:val="18"/>
+                <w:szCs w:val="18"/>
+              </w:rPr>
+              <w:t>1}</w:t>
             </w:r>
           </w:p>
         </w:tc>
@@ -1231,7 +1350,28 @@
                 <w:sz w:val="18"/>
                 <w:szCs w:val="18"/>
               </w:rPr>
-              <w:t>Material Request</w:t>
+              <w:t>{</w:t>
+            </w:r>
+            <w:r>
+              <w:rPr>
+                <w:sz w:val="18"/>
+                <w:szCs w:val="18"/>
+              </w:rPr>
+              <w:t>service_name</w:t>
+            </w:r>
+            <w:r>
+              <w:rPr>
+                <w:sz w:val="18"/>
+                <w:szCs w:val="18"/>
+              </w:rPr>
+              <w:t>2</w:t>
+            </w:r>
+            <w:r>
+              <w:rPr>
+                <w:sz w:val="18"/>
+                <w:szCs w:val="18"/>
+              </w:rPr>
+              <w:t>}</w:t>
             </w:r>
           </w:p>
         </w:tc>
@@ -1252,7 +1392,28 @@
                 <w:sz w:val="18"/>
                 <w:szCs w:val="18"/>
               </w:rPr>
-              <w:t>10</w:t>
+              <w:t>{sNegP</w:t>
+            </w:r>
+            <w:r>
+              <w:rPr>
+                <w:sz w:val="18"/>
+                <w:szCs w:val="18"/>
+              </w:rPr>
+              <w:t>2</w:t>
+            </w:r>
+            <w:r>
+              <w:rPr>
+                <w:sz w:val="18"/>
+                <w:szCs w:val="18"/>
+              </w:rPr>
+              <w:t>}</w:t>
+            </w:r>
+            <w:r>
+              <w:rPr>
+                <w:sz w:val="18"/>
+                <w:szCs w:val="18"/>
+              </w:rPr>
+              <w:t>%</w:t>
             </w:r>
           </w:p>
         </w:tc>
@@ -1273,7 +1434,21 @@
                 <w:sz w:val="18"/>
                 <w:szCs w:val="18"/>
               </w:rPr>
-              <w:t>10</w:t>
+              <w:t>{sNegC</w:t>
+            </w:r>
+            <w:r>
+              <w:rPr>
+                <w:sz w:val="18"/>
+                <w:szCs w:val="18"/>
+              </w:rPr>
+              <w:t>2</w:t>
+            </w:r>
+            <w:r>
+              <w:rPr>
+                <w:sz w:val="18"/>
+                <w:szCs w:val="18"/>
+              </w:rPr>
+              <w:t>}</w:t>
             </w:r>
           </w:p>
         </w:tc>
@@ -1294,7 +1469,28 @@
                 <w:sz w:val="18"/>
                 <w:szCs w:val="18"/>
               </w:rPr>
-              <w:t>20</w:t>
+              <w:t>{sNeuP</w:t>
+            </w:r>
+            <w:r>
+              <w:rPr>
+                <w:sz w:val="18"/>
+                <w:szCs w:val="18"/>
+              </w:rPr>
+              <w:t>2</w:t>
+            </w:r>
+            <w:r>
+              <w:rPr>
+                <w:sz w:val="18"/>
+                <w:szCs w:val="18"/>
+              </w:rPr>
+              <w:t>}</w:t>
+            </w:r>
+            <w:r>
+              <w:rPr>
+                <w:sz w:val="18"/>
+                <w:szCs w:val="18"/>
+              </w:rPr>
+              <w:t>%</w:t>
             </w:r>
           </w:p>
         </w:tc>
@@ -1315,7 +1511,21 @@
                 <w:sz w:val="18"/>
                 <w:szCs w:val="18"/>
               </w:rPr>
-              <w:t>20</w:t>
+              <w:t>{sNeuC</w:t>
+            </w:r>
+            <w:r>
+              <w:rPr>
+                <w:sz w:val="18"/>
+                <w:szCs w:val="18"/>
+              </w:rPr>
+              <w:t>2</w:t>
+            </w:r>
+            <w:r>
+              <w:rPr>
+                <w:sz w:val="18"/>
+                <w:szCs w:val="18"/>
+              </w:rPr>
+              <w:t>}</w:t>
             </w:r>
           </w:p>
         </w:tc>
@@ -1336,7 +1546,28 @@
                 <w:sz w:val="18"/>
                 <w:szCs w:val="18"/>
               </w:rPr>
-              <w:t>70</w:t>
+              <w:t>{sPosP</w:t>
+            </w:r>
+            <w:r>
+              <w:rPr>
+                <w:sz w:val="18"/>
+                <w:szCs w:val="18"/>
+              </w:rPr>
+              <w:t>2</w:t>
+            </w:r>
+            <w:r>
+              <w:rPr>
+                <w:sz w:val="18"/>
+                <w:szCs w:val="18"/>
+              </w:rPr>
+              <w:t>}</w:t>
+            </w:r>
+            <w:r>
+              <w:rPr>
+                <w:sz w:val="18"/>
+                <w:szCs w:val="18"/>
+              </w:rPr>
+              <w:t>%</w:t>
             </w:r>
           </w:p>
         </w:tc>
@@ -1357,7 +1588,21 @@
                 <w:sz w:val="18"/>
                 <w:szCs w:val="18"/>
               </w:rPr>
-              <w:t>70</w:t>
+              <w:t>{sPos</w:t>
+            </w:r>
+            <w:r>
+              <w:rPr>
+                <w:sz w:val="18"/>
+                <w:szCs w:val="18"/>
+              </w:rPr>
+              <w:t>C2</w:t>
+            </w:r>
+            <w:r>
+              <w:rPr>
+                <w:sz w:val="18"/>
+                <w:szCs w:val="18"/>
+              </w:rPr>
+              <w:t>}</w:t>
             </w:r>
           </w:p>
         </w:tc>
@@ -1379,7 +1624,28 @@
                 <w:sz w:val="18"/>
                 <w:szCs w:val="18"/>
               </w:rPr>
-              <w:t>Offline Library Literacy Program</w:t>
+              <w:t>{</w:t>
+            </w:r>
+            <w:r>
+              <w:rPr>
+                <w:sz w:val="18"/>
+                <w:szCs w:val="18"/>
+              </w:rPr>
+              <w:t>service_name</w:t>
+            </w:r>
+            <w:r>
+              <w:rPr>
+                <w:sz w:val="18"/>
+                <w:szCs w:val="18"/>
+              </w:rPr>
+              <w:t>3</w:t>
+            </w:r>
+            <w:r>
+              <w:rPr>
+                <w:sz w:val="18"/>
+                <w:szCs w:val="18"/>
+              </w:rPr>
+              <w:t>}</w:t>
             </w:r>
           </w:p>
         </w:tc>
@@ -1400,7 +1666,28 @@
                 <w:sz w:val="18"/>
                 <w:szCs w:val="18"/>
               </w:rPr>
-              <w:t>20</w:t>
+              <w:t>{sNegP</w:t>
+            </w:r>
+            <w:r>
+              <w:rPr>
+                <w:sz w:val="18"/>
+                <w:szCs w:val="18"/>
+              </w:rPr>
+              <w:t>3</w:t>
+            </w:r>
+            <w:r>
+              <w:rPr>
+                <w:sz w:val="18"/>
+                <w:szCs w:val="18"/>
+              </w:rPr>
+              <w:t>}</w:t>
+            </w:r>
+            <w:r>
+              <w:rPr>
+                <w:sz w:val="18"/>
+                <w:szCs w:val="18"/>
+              </w:rPr>
+              <w:t>%</w:t>
             </w:r>
           </w:p>
         </w:tc>
@@ -1421,7 +1708,21 @@
                 <w:sz w:val="18"/>
                 <w:szCs w:val="18"/>
               </w:rPr>
-              <w:t>20</w:t>
+              <w:t>{sNegC</w:t>
+            </w:r>
+            <w:r>
+              <w:rPr>
+                <w:sz w:val="18"/>
+                <w:szCs w:val="18"/>
+              </w:rPr>
+              <w:t>3</w:t>
+            </w:r>
+            <w:r>
+              <w:rPr>
+                <w:sz w:val="18"/>
+                <w:szCs w:val="18"/>
+              </w:rPr>
+              <w:t>}</w:t>
             </w:r>
           </w:p>
         </w:tc>
@@ -1442,7 +1743,28 @@
                 <w:sz w:val="18"/>
                 <w:szCs w:val="18"/>
               </w:rPr>
-              <w:t>30</w:t>
+              <w:t>{sNeuP</w:t>
+            </w:r>
+            <w:r>
+              <w:rPr>
+                <w:sz w:val="18"/>
+                <w:szCs w:val="18"/>
+              </w:rPr>
+              <w:t>3</w:t>
+            </w:r>
+            <w:r>
+              <w:rPr>
+                <w:sz w:val="18"/>
+                <w:szCs w:val="18"/>
+              </w:rPr>
+              <w:t>}</w:t>
+            </w:r>
+            <w:r>
+              <w:rPr>
+                <w:sz w:val="18"/>
+                <w:szCs w:val="18"/>
+              </w:rPr>
+              <w:t>%</w:t>
             </w:r>
           </w:p>
         </w:tc>
@@ -1463,7 +1785,21 @@
                 <w:sz w:val="18"/>
                 <w:szCs w:val="18"/>
               </w:rPr>
-              <w:t>30</w:t>
+              <w:t>{sNeuC</w:t>
+            </w:r>
+            <w:r>
+              <w:rPr>
+                <w:sz w:val="18"/>
+                <w:szCs w:val="18"/>
+              </w:rPr>
+              <w:t>3</w:t>
+            </w:r>
+            <w:r>
+              <w:rPr>
+                <w:sz w:val="18"/>
+                <w:szCs w:val="18"/>
+              </w:rPr>
+              <w:t>}</w:t>
             </w:r>
           </w:p>
         </w:tc>
@@ -1484,7 +1820,28 @@
                 <w:sz w:val="18"/>
                 <w:szCs w:val="18"/>
               </w:rPr>
-              <w:t>50</w:t>
+              <w:t>{sPosP</w:t>
+            </w:r>
+            <w:r>
+              <w:rPr>
+                <w:sz w:val="18"/>
+                <w:szCs w:val="18"/>
+              </w:rPr>
+              <w:t>3</w:t>
+            </w:r>
+            <w:r>
+              <w:rPr>
+                <w:sz w:val="18"/>
+                <w:szCs w:val="18"/>
+              </w:rPr>
+              <w:t>}</w:t>
+            </w:r>
+            <w:r>
+              <w:rPr>
+                <w:sz w:val="18"/>
+                <w:szCs w:val="18"/>
+              </w:rPr>
+              <w:t>%</w:t>
             </w:r>
           </w:p>
         </w:tc>
@@ -1505,7 +1862,21 @@
                 <w:sz w:val="18"/>
                 <w:szCs w:val="18"/>
               </w:rPr>
-              <w:t>50</w:t>
+              <w:t>{sPos</w:t>
+            </w:r>
+            <w:r>
+              <w:rPr>
+                <w:sz w:val="18"/>
+                <w:szCs w:val="18"/>
+              </w:rPr>
+              <w:t>C3</w:t>
+            </w:r>
+            <w:r>
+              <w:rPr>
+                <w:sz w:val="18"/>
+                <w:szCs w:val="18"/>
+              </w:rPr>
+              <w:t>}</w:t>
             </w:r>
           </w:p>
         </w:tc>
@@ -1527,7 +1898,28 @@
                 <w:sz w:val="18"/>
                 <w:szCs w:val="18"/>
               </w:rPr>
-              <w:t>Tour and Orientation</w:t>
+              <w:t>{</w:t>
+            </w:r>
+            <w:r>
+              <w:rPr>
+                <w:sz w:val="18"/>
+                <w:szCs w:val="18"/>
+              </w:rPr>
+              <w:t>service_name</w:t>
+            </w:r>
+            <w:r>
+              <w:rPr>
+                <w:sz w:val="18"/>
+                <w:szCs w:val="18"/>
+              </w:rPr>
+              <w:t>4</w:t>
+            </w:r>
+            <w:r>
+              <w:rPr>
+                <w:sz w:val="18"/>
+                <w:szCs w:val="18"/>
+              </w:rPr>
+              <w:t>}</w:t>
             </w:r>
           </w:p>
         </w:tc>
@@ -1548,7 +1940,28 @@
                 <w:sz w:val="18"/>
                 <w:szCs w:val="18"/>
               </w:rPr>
-              <w:t>50</w:t>
+              <w:t>{sNegP</w:t>
+            </w:r>
+            <w:r>
+              <w:rPr>
+                <w:sz w:val="18"/>
+                <w:szCs w:val="18"/>
+              </w:rPr>
+              <w:t>4</w:t>
+            </w:r>
+            <w:r>
+              <w:rPr>
+                <w:sz w:val="18"/>
+                <w:szCs w:val="18"/>
+              </w:rPr>
+              <w:t>}</w:t>
+            </w:r>
+            <w:r>
+              <w:rPr>
+                <w:sz w:val="18"/>
+                <w:szCs w:val="18"/>
+              </w:rPr>
+              <w:t>%</w:t>
             </w:r>
           </w:p>
         </w:tc>
@@ -1569,7 +1982,21 @@
                 <w:sz w:val="18"/>
                 <w:szCs w:val="18"/>
               </w:rPr>
-              <w:t>50</w:t>
+              <w:t>{sNegC</w:t>
+            </w:r>
+            <w:r>
+              <w:rPr>
+                <w:sz w:val="18"/>
+                <w:szCs w:val="18"/>
+              </w:rPr>
+              <w:t>4</w:t>
+            </w:r>
+            <w:r>
+              <w:rPr>
+                <w:sz w:val="18"/>
+                <w:szCs w:val="18"/>
+              </w:rPr>
+              <w:t>}</w:t>
             </w:r>
           </w:p>
         </w:tc>
@@ -1590,7 +2017,28 @@
                 <w:sz w:val="18"/>
                 <w:szCs w:val="18"/>
               </w:rPr>
-              <w:t>10</w:t>
+              <w:t>{sNeuP</w:t>
+            </w:r>
+            <w:r>
+              <w:rPr>
+                <w:sz w:val="18"/>
+                <w:szCs w:val="18"/>
+              </w:rPr>
+              <w:t>4</w:t>
+            </w:r>
+            <w:r>
+              <w:rPr>
+                <w:sz w:val="18"/>
+                <w:szCs w:val="18"/>
+              </w:rPr>
+              <w:t>}</w:t>
+            </w:r>
+            <w:r>
+              <w:rPr>
+                <w:sz w:val="18"/>
+                <w:szCs w:val="18"/>
+              </w:rPr>
+              <w:t>%</w:t>
             </w:r>
           </w:p>
         </w:tc>
@@ -1611,7 +2059,21 @@
                 <w:sz w:val="18"/>
                 <w:szCs w:val="18"/>
               </w:rPr>
-              <w:t>10</w:t>
+              <w:t>{sNeuC</w:t>
+            </w:r>
+            <w:r>
+              <w:rPr>
+                <w:sz w:val="18"/>
+                <w:szCs w:val="18"/>
+              </w:rPr>
+              <w:t>4</w:t>
+            </w:r>
+            <w:r>
+              <w:rPr>
+                <w:sz w:val="18"/>
+                <w:szCs w:val="18"/>
+              </w:rPr>
+              <w:t>}</w:t>
             </w:r>
           </w:p>
         </w:tc>
@@ -1632,7 +2094,28 @@
                 <w:sz w:val="18"/>
                 <w:szCs w:val="18"/>
               </w:rPr>
-              <w:t>40</w:t>
+              <w:t>{sPosP</w:t>
+            </w:r>
+            <w:r>
+              <w:rPr>
+                <w:sz w:val="18"/>
+                <w:szCs w:val="18"/>
+              </w:rPr>
+              <w:t>4</w:t>
+            </w:r>
+            <w:r>
+              <w:rPr>
+                <w:sz w:val="18"/>
+                <w:szCs w:val="18"/>
+              </w:rPr>
+              <w:t>}</w:t>
+            </w:r>
+            <w:r>
+              <w:rPr>
+                <w:sz w:val="18"/>
+                <w:szCs w:val="18"/>
+              </w:rPr>
+              <w:t>%</w:t>
             </w:r>
           </w:p>
         </w:tc>
@@ -1653,7 +2136,21 @@
                 <w:sz w:val="18"/>
                 <w:szCs w:val="18"/>
               </w:rPr>
-              <w:t>40</w:t>
+              <w:t>{sPos</w:t>
+            </w:r>
+            <w:r>
+              <w:rPr>
+                <w:sz w:val="18"/>
+                <w:szCs w:val="18"/>
+              </w:rPr>
+              <w:t>C4</w:t>
+            </w:r>
+            <w:r>
+              <w:rPr>
+                <w:sz w:val="18"/>
+                <w:szCs w:val="18"/>
+              </w:rPr>
+              <w:t>}</w:t>
             </w:r>
           </w:p>
         </w:tc>
@@ -3538,7 +4035,6 @@
   <w:style w:type="character" w:default="1" w:styleId="DefaultParagraphFont">
     <w:name w:val="Default Paragraph Font"/>
     <w:uiPriority w:val="1"/>
-    <w:semiHidden/>
     <w:unhideWhenUsed/>
   </w:style>
   <w:style w:type="table" w:default="1" w:styleId="TableNormal">

</xml_diff>

<commit_message>
Change Color scheme of auth page based on DOST's Visual Identity Manual
</commit_message>
<xml_diff>
--- a/frontend/public/templates/ReportTemplate.docx
+++ b/frontend/public/templates/ReportTemplate.docx
@@ -1,6 +1,6 @@
 
 <file path=word/document.xml><?xml version="1.0" encoding="utf-8"?>
-<w:document xmlns:wpc="http://schemas.microsoft.com/office/word/2010/wordprocessingCanvas" xmlns:cx="http://schemas.microsoft.com/office/drawing/2014/chartex" xmlns:cx1="http://schemas.microsoft.com/office/drawing/2015/9/8/chartex" xmlns:cx2="http://schemas.microsoft.com/office/drawing/2015/10/21/chartex" xmlns:cx3="http://schemas.microsoft.com/office/drawing/2016/5/9/chartex" xmlns:cx4="http://schemas.microsoft.com/office/drawing/2016/5/10/chartex" xmlns:cx5="http://schemas.microsoft.com/office/drawing/2016/5/11/chartex" xmlns:cx6="http://schemas.microsoft.com/office/drawing/2016/5/12/chartex" xmlns:cx7="http://schemas.microsoft.com/office/drawing/2016/5/13/chartex" xmlns:cx8="http://schemas.microsoft.com/office/drawing/2016/5/14/chartex" xmlns:mc="http://schemas.openxmlformats.org/markup-compatibility/2006" xmlns:aink="http://schemas.microsoft.com/office/drawing/2016/ink" xmlns:am3d="http://schemas.microsoft.com/office/drawing/2017/model3d" xmlns:o="urn:schemas-microsoft-com:office:office" xmlns:oel="http://schemas.microsoft.com/office/2019/extlst" xmlns:r="http://schemas.openxmlformats.org/officeDocument/2006/relationships" xmlns:m="http://schemas.openxmlformats.org/officeDocument/2006/math" xmlns:v="urn:schemas-microsoft-com:vml" xmlns:wp14="http://schemas.microsoft.com/office/word/2010/wordprocessingDrawing" xmlns:wp="http://schemas.openxmlformats.org/drawingml/2006/wordprocessingDrawing" xmlns:w10="urn:schemas-microsoft-com:office:word" xmlns:w="http://schemas.openxmlformats.org/wordprocessingml/2006/main" xmlns:w14="http://schemas.microsoft.com/office/word/2010/wordml" xmlns:w15="http://schemas.microsoft.com/office/word/2012/wordml" xmlns:w16cex="http://schemas.microsoft.com/office/word/2018/wordml/cex" xmlns:w16cid="http://schemas.microsoft.com/office/word/2016/wordml/cid" xmlns:w16="http://schemas.microsoft.com/office/word/2018/wordml" xmlns:w16du="http://schemas.microsoft.com/office/word/2023/wordml/word16du" xmlns:w16sdtdh="http://schemas.microsoft.com/office/word/2020/wordml/sdtdatahash" xmlns:w16sdtfl="http://schemas.microsoft.com/office/word/2024/wordml/sdtformatlock" xmlns:w16se="http://schemas.microsoft.com/office/word/2015/wordml/symex" xmlns:wpg="http://schemas.microsoft.com/office/word/2010/wordprocessingGroup" xmlns:wpi="http://schemas.microsoft.com/office/word/2010/wordprocessingInk" xmlns:wne="http://schemas.microsoft.com/office/word/2006/wordml" xmlns:wps="http://schemas.microsoft.com/office/word/2010/wordprocessingShape" mc:Ignorable="w14 w15 w16se w16cid w16 w16cex w16sdtdh w16sdtfl w16du wp14">
+<w:document xmlns:wpc="http://schemas.microsoft.com/office/word/2010/wordprocessingCanvas" xmlns:cx="http://schemas.microsoft.com/office/drawing/2014/chartex" xmlns:cx1="http://schemas.microsoft.com/office/drawing/2015/9/8/chartex" xmlns:cx2="http://schemas.microsoft.com/office/drawing/2015/10/21/chartex" xmlns:cx3="http://schemas.microsoft.com/office/drawing/2016/5/9/chartex" xmlns:cx4="http://schemas.microsoft.com/office/drawing/2016/5/10/chartex" xmlns:cx5="http://schemas.microsoft.com/office/drawing/2016/5/11/chartex" xmlns:cx6="http://schemas.microsoft.com/office/drawing/2016/5/12/chartex" xmlns:cx7="http://schemas.microsoft.com/office/drawing/2016/5/13/chartex" xmlns:cx8="http://schemas.microsoft.com/office/drawing/2016/5/14/chartex" xmlns:mc="http://schemas.openxmlformats.org/markup-compatibility/2006" xmlns:m="http://schemas.openxmlformats.org/officeDocument/2006/math" xmlns:aink="http://schemas.microsoft.com/office/drawing/2016/ink" xmlns:am3d="http://schemas.microsoft.com/office/drawing/2017/model3d" xmlns:oel="http://schemas.microsoft.com/office/2019/extlst" xmlns:r="http://schemas.openxmlformats.org/officeDocument/2006/relationships" xmlns:wp14="http://schemas.microsoft.com/office/word/2010/wordprocessingDrawing" xmlns:wp="http://schemas.openxmlformats.org/drawingml/2006/wordprocessingDrawing" xmlns:wpg="http://schemas.microsoft.com/office/word/2010/wordprocessingGroup" xmlns:wpi="http://schemas.microsoft.com/office/word/2010/wordprocessingInk" xmlns:wps="http://schemas.microsoft.com/office/word/2010/wordprocessingShape" xmlns:o="urn:schemas-microsoft-com:office:office" xmlns:v="urn:schemas-microsoft-com:vml" xmlns:w10="urn:schemas-microsoft-com:office:word" xmlns:w="http://schemas.openxmlformats.org/wordprocessingml/2006/main" xmlns:w14="http://schemas.microsoft.com/office/word/2010/wordml" xmlns:w15="http://schemas.microsoft.com/office/word/2012/wordml" xmlns:w16cex="http://schemas.microsoft.com/office/word/2018/wordml/cex" xmlns:w16cid="http://schemas.microsoft.com/office/word/2016/wordml/cid" xmlns:w16="http://schemas.microsoft.com/office/word/2018/wordml" xmlns:w16sdtdh="http://schemas.microsoft.com/office/word/2020/wordml/sdtdatahash" xmlns:w16sdtfl="http://schemas.microsoft.com/office/word/2024/wordml/sdtformatlock" xmlns:w16se="http://schemas.microsoft.com/office/word/2015/wordml/symex" xmlns:w16du="http://schemas.microsoft.com/office/word/2023/wordml/word16du" xmlns:wne="http://schemas.microsoft.com/office/word/2006/wordml" mc:Ignorable="w14 w15 w16se w16cid w16 w16cex w16sdtdh w16sdtfl w16du wp14">
   <w:body>
     <w:p>
       <w:pPr>
@@ -54,6 +54,7 @@
         </w:rPr>
         <w:t>{</w:t>
       </w:r>
+      <w:proofErr w:type="spellStart"/>
       <w:r>
         <w:rPr>
           <w:i/>
@@ -63,6 +64,7 @@
         </w:rPr>
         <w:t>date_now</w:t>
       </w:r>
+      <w:proofErr w:type="spellEnd"/>
       <w:r>
         <w:rPr>
           <w:i/>
@@ -76,6 +78,64 @@
     <w:p>
       <w:pPr>
         <w:jc w:val="center"/>
+        <w:rPr>
+          <w:i/>
+          <w:iCs/>
+          <w:sz w:val="24"/>
+          <w:szCs w:val="24"/>
+        </w:rPr>
+      </w:pPr>
+      <w:r>
+        <w:rPr>
+          <w:i/>
+          <w:iCs/>
+          <w:sz w:val="24"/>
+          <w:szCs w:val="24"/>
+        </w:rPr>
+        <w:t>Model v</w:t>
+      </w:r>
+      <w:r>
+        <w:rPr>
+          <w:i/>
+          <w:iCs/>
+          <w:sz w:val="24"/>
+          <w:szCs w:val="24"/>
+        </w:rPr>
+        <w:t xml:space="preserve">ersion used: </w:t>
+      </w:r>
+      <w:r>
+        <w:rPr>
+          <w:i/>
+          <w:iCs/>
+          <w:sz w:val="24"/>
+          <w:szCs w:val="24"/>
+        </w:rPr>
+        <w:t>{</w:t>
+      </w:r>
+      <w:proofErr w:type="spellStart"/>
+      <w:r>
+        <w:rPr>
+          <w:i/>
+          <w:iCs/>
+          <w:sz w:val="24"/>
+          <w:szCs w:val="24"/>
+        </w:rPr>
+        <w:t>model_name</w:t>
+      </w:r>
+      <w:proofErr w:type="spellEnd"/>
+      <w:r>
+        <w:rPr>
+          <w:i/>
+          <w:iCs/>
+          <w:sz w:val="24"/>
+          <w:szCs w:val="24"/>
+        </w:rPr>
+        <w:t>}</w:t>
+      </w:r>
+    </w:p>
+    <w:p>
+      <w:pPr>
+        <w:jc w:val="center"/>
       </w:pPr>
       <w:r>
         <w:t>Filters applied:</w:t>
@@ -84,13 +144,16 @@
         <w:t xml:space="preserve"> </w:t>
       </w:r>
       <w:r>
-        <w:t>{filters_applied}</w:t>
+        <w:t>{</w:t>
       </w:r>
-    </w:p>
-    <w:p>
-      <w:pPr>
-        <w:jc w:val="center"/>
-      </w:pPr>
+      <w:proofErr w:type="spellStart"/>
+      <w:r>
+        <w:t>filters_applied</w:t>
+      </w:r>
+      <w:proofErr w:type="spellEnd"/>
+      <w:r>
+        <w:t>}</w:t>
+      </w:r>
       <w:r>
         <w:rPr>
           <w:noProof/>
@@ -161,85 +224,8 @@
           </mc:Fallback>
         </mc:AlternateContent>
       </w:r>
-      <w:r>
-        <w:t>Excluded Data</w:t>
-      </w:r>
-      <w:r>
-        <w:t xml:space="preserve">: </w:t>
-      </w:r>
-      <w:r>
-        <w:t xml:space="preserve"> January 1, 2025 – June 30, 2025</w:t>
-      </w:r>
     </w:p>
-    <w:p>
-      <w:pPr>
-        <w:jc w:val="center"/>
-        <w:rPr>
-          <w:i/>
-          <w:iCs/>
-        </w:rPr>
-      </w:pPr>
-    </w:p>
-    <w:p>
-      <w:r>
-        <w:rPr>
-          <w:noProof/>
-        </w:rPr>
-        <w:drawing>
-          <wp:inline distT="0" distB="0" distL="0" distR="0" wp14:anchorId="04A4922D" wp14:editId="021A08CF">
-            <wp:extent cx="5931535" cy="4008120"/>
-            <wp:effectExtent l="0" t="0" r="0" b="0"/>
-            <wp:docPr id="1299587151" name="Picture 5"/>
-            <wp:cNvGraphicFramePr>
-              <a:graphicFrameLocks xmlns:a="http://schemas.openxmlformats.org/drawingml/2006/main" noChangeAspect="1"/>
-            </wp:cNvGraphicFramePr>
-            <a:graphic xmlns:a="http://schemas.openxmlformats.org/drawingml/2006/main">
-              <a:graphicData uri="http://schemas.openxmlformats.org/drawingml/2006/picture">
-                <pic:pic xmlns:pic="http://schemas.openxmlformats.org/drawingml/2006/picture">
-                  <pic:nvPicPr>
-                    <pic:cNvPr id="0" name="Picture 4"/>
-                    <pic:cNvPicPr>
-                      <a:picLocks noChangeAspect="1" noChangeArrowheads="1"/>
-                    </pic:cNvPicPr>
-                  </pic:nvPicPr>
-                  <pic:blipFill rotWithShape="1">
-                    <a:blip r:embed="rId5">
-                      <a:extLst>
-                        <a:ext uri="{28A0092B-C50C-407E-A947-70E740481C1C}">
-                          <a14:useLocalDpi xmlns:a14="http://schemas.microsoft.com/office/drawing/2010/main" val="0"/>
-                        </a:ext>
-                      </a:extLst>
-                    </a:blip>
-                    <a:srcRect l="100" t="9777" r="-100" b="-9777"/>
-                    <a:stretch>
-                      <a:fillRect/>
-                    </a:stretch>
-                  </pic:blipFill>
-                  <pic:spPr bwMode="auto">
-                    <a:xfrm>
-                      <a:off x="0" y="0"/>
-                      <a:ext cx="5931535" cy="4008120"/>
-                    </a:xfrm>
-                    <a:prstGeom prst="rect">
-                      <a:avLst/>
-                    </a:prstGeom>
-                    <a:noFill/>
-                    <a:ln>
-                      <a:noFill/>
-                    </a:ln>
-                    <a:extLst>
-                      <a:ext uri="{53640926-AAD7-44D8-BBD7-CCE9431645EC}">
-                        <a14:shadowObscured xmlns:a14="http://schemas.microsoft.com/office/drawing/2010/main"/>
-                      </a:ext>
-                    </a:extLst>
-                  </pic:spPr>
-                </pic:pic>
-              </a:graphicData>
-            </a:graphic>
-          </wp:inline>
-        </w:drawing>
-      </w:r>
-    </w:p>
+    <w:p/>
     <w:p>
       <w:pPr>
         <w:jc w:val="center"/>
@@ -290,6 +276,7 @@
         </w:rPr>
         <w:t>: {</w:t>
       </w:r>
+      <w:proofErr w:type="spellStart"/>
       <w:r>
         <w:rPr>
           <w:b/>
@@ -299,6 +286,7 @@
         </w:rPr>
         <w:t>totalCount</w:t>
       </w:r>
+      <w:proofErr w:type="spellEnd"/>
       <w:r>
         <w:rPr>
           <w:b/>
@@ -311,9 +299,17 @@
     </w:p>
     <w:p>
       <w:r>
+        <w:rPr>
+          <w:b/>
+          <w:bCs/>
+        </w:rPr>
         <w:t>Overall Sentiment</w:t>
       </w:r>
       <w:r>
+        <w:rPr>
+          <w:b/>
+          <w:bCs/>
+        </w:rPr>
         <w:t>:</w:t>
       </w:r>
       <w:r>
@@ -325,120 +321,46 @@
     </w:p>
     <w:p>
       <w:r>
-        <w:rPr>
-          <w:noProof/>
-        </w:rPr>
-        <mc:AlternateContent>
-          <mc:Choice Requires="wps">
-            <w:drawing>
-              <wp:anchor distT="45720" distB="45720" distL="114300" distR="114300" simplePos="0" relativeHeight="251661312" behindDoc="0" locked="0" layoutInCell="1" allowOverlap="1" wp14:anchorId="5D97A120" wp14:editId="16901C72">
-                <wp:simplePos x="0" y="0"/>
-                <wp:positionH relativeFrom="margin">
-                  <wp:align>left</wp:align>
-                </wp:positionH>
-                <wp:positionV relativeFrom="paragraph">
-                  <wp:posOffset>300990</wp:posOffset>
-                </wp:positionV>
-                <wp:extent cx="6495415" cy="1104265"/>
-                <wp:effectExtent l="0" t="0" r="19685" b="19685"/>
-                <wp:wrapSquare wrapText="bothSides"/>
-                <wp:docPr id="217" name="Text Box 2"/>
-                <wp:cNvGraphicFramePr>
-                  <a:graphicFrameLocks xmlns:a="http://schemas.openxmlformats.org/drawingml/2006/main"/>
-                </wp:cNvGraphicFramePr>
-                <a:graphic xmlns:a="http://schemas.openxmlformats.org/drawingml/2006/main">
-                  <a:graphicData uri="http://schemas.microsoft.com/office/word/2010/wordprocessingShape">
-                    <wps:wsp>
-                      <wps:cNvSpPr txBox="1">
-                        <a:spLocks noChangeArrowheads="1"/>
-                      </wps:cNvSpPr>
-                      <wps:spPr bwMode="auto">
-                        <a:xfrm>
-                          <a:off x="0" y="0"/>
-                          <a:ext cx="6495415" cy="1104595"/>
-                        </a:xfrm>
-                        <a:prstGeom prst="rect">
-                          <a:avLst/>
-                        </a:prstGeom>
-                        <a:solidFill>
-                          <a:srgbClr val="FFFFFF"/>
-                        </a:solidFill>
-                        <a:ln w="9525">
-                          <a:solidFill>
-                            <a:srgbClr val="000000"/>
-                          </a:solidFill>
-                          <a:miter lim="800000"/>
-                          <a:headEnd/>
-                          <a:tailEnd/>
-                        </a:ln>
-                      </wps:spPr>
-                      <wps:txbx>
-                        <w:txbxContent>
-                          <w:p>
-                            <w:r>
-                              <w:t>Hello world</w:t>
-                            </w:r>
-                          </w:p>
-                        </w:txbxContent>
-                      </wps:txbx>
-                      <wps:bodyPr rot="0" vert="horz" wrap="square" lIns="91440" tIns="45720" rIns="91440" bIns="45720" anchor="t" anchorCtr="0">
-                        <a:noAutofit/>
-                      </wps:bodyPr>
-                    </wps:wsp>
-                  </a:graphicData>
-                </a:graphic>
-                <wp14:sizeRelH relativeFrom="margin">
-                  <wp14:pctWidth>0</wp14:pctWidth>
-                </wp14:sizeRelH>
-                <wp14:sizeRelV relativeFrom="margin">
-                  <wp14:pctHeight>0</wp14:pctHeight>
-                </wp14:sizeRelV>
-              </wp:anchor>
-            </w:drawing>
-          </mc:Choice>
-          <mc:Fallback>
-            <w:pict>
-              <v:shapetype w14:anchorId="5D97A120" id="_x0000_t202" coordsize="21600,21600" o:spt="202" path="m,l,21600r21600,l21600,xe">
-                <v:stroke joinstyle="miter"/>
-                <v:path gradientshapeok="t" o:connecttype="rect"/>
-              </v:shapetype>
-              <v:shape id="Text Box 2" o:spid="_x0000_s1026" type="#_x0000_t202" style="position:absolute;margin-left:0;margin-top:23.7pt;width:511.45pt;height:86.95pt;z-index:251661312;visibility:visible;mso-wrap-style:square;mso-width-percent:0;mso-height-percent:0;mso-wrap-distance-left:9pt;mso-wrap-distance-top:3.6pt;mso-wrap-distance-right:9pt;mso-wrap-distance-bottom:3.6pt;mso-position-horizontal:left;mso-position-horizontal-relative:margin;mso-position-vertical:absolute;mso-position-vertical-relative:text;mso-width-percent:0;mso-height-percent:0;mso-width-relative:margin;mso-height-relative:margin;v-text-anchor:top" o:gfxdata="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">
-                <v:textbox>
-                  <w:txbxContent>
-                    <w:p>
-                      <w:r>
-                        <w:t>Hello world</w:t>
-                      </w:r>
-                    </w:p>
-                  </w:txbxContent>
-                </v:textbox>
-                <w10:wrap type="square" anchorx="margin"/>
-              </v:shape>
-            </w:pict>
-          </mc:Fallback>
-        </mc:AlternateContent>
-      </w:r>
-      <w:r>
         <w:t>User Input</w:t>
       </w:r>
       <w:r>
         <w:t>:</w:t>
       </w:r>
     </w:p>
+    <w:tbl>
+      <w:tblPr>
+        <w:tblStyle w:val="TableGrid"/>
+        <w:tblW w:w="0" w:type="auto"/>
+        <w:tblLook w:val="04A0" w:firstRow="1" w:lastRow="0" w:firstColumn="1" w:lastColumn="0" w:noHBand="0" w:noVBand="1"/>
+      </w:tblPr>
+      <w:tblGrid>
+        <w:gridCol w:w="9350"/>
+      </w:tblGrid>
+      <w:tr>
+        <w:trPr>
+          <w:trHeight w:val="1511"/>
+        </w:trPr>
+        <w:tc>
+          <w:tcPr>
+            <w:tcW w:w="9350" w:type="dxa"/>
+          </w:tcPr>
+          <w:p/>
+        </w:tc>
+      </w:tr>
+    </w:tbl>
     <w:p/>
     <w:p>
+      <w:pPr>
+        <w:rPr>
+          <w:b/>
+          <w:bCs/>
+        </w:rPr>
+      </w:pPr>
       <w:r>
-        <w:lastRenderedPageBreak/>
-        <w:t>{genderValue}</w:t>
-      </w:r>
-    </w:p>
-    <w:p>
-      <w:r>
-        <w:t>{serviceValue}</w:t>
-      </w:r>
-    </w:p>
-    <w:p>
-      <w:r>
+        <w:rPr>
+          <w:b/>
+          <w:bCs/>
+        </w:rPr>
         <w:t>Sentiment By Gender:</w:t>
       </w:r>
     </w:p>
@@ -450,11 +372,11 @@
       </w:tblPr>
       <w:tblGrid>
         <w:gridCol w:w="1482"/>
-        <w:gridCol w:w="1518"/>
+        <w:gridCol w:w="1517"/>
         <w:gridCol w:w="1475"/>
         <w:gridCol w:w="1452"/>
         <w:gridCol w:w="1206"/>
-        <w:gridCol w:w="1211"/>
+        <w:gridCol w:w="1212"/>
         <w:gridCol w:w="1006"/>
       </w:tblGrid>
       <w:tr>
@@ -651,7 +573,23 @@
                 <w:sz w:val="18"/>
                 <w:szCs w:val="18"/>
               </w:rPr>
-              <w:t>{NegP}%</w:t>
+              <w:t>{</w:t>
+            </w:r>
+            <w:proofErr w:type="spellStart"/>
+            <w:r>
+              <w:rPr>
+                <w:sz w:val="18"/>
+                <w:szCs w:val="18"/>
+              </w:rPr>
+              <w:t>NegP</w:t>
+            </w:r>
+            <w:proofErr w:type="spellEnd"/>
+            <w:r>
+              <w:rPr>
+                <w:sz w:val="18"/>
+                <w:szCs w:val="18"/>
+              </w:rPr>
+              <w:t>}%</w:t>
             </w:r>
           </w:p>
         </w:tc>
@@ -672,7 +610,23 @@
                 <w:sz w:val="18"/>
                 <w:szCs w:val="18"/>
               </w:rPr>
-              <w:t>{NegC}</w:t>
+              <w:t>{</w:t>
+            </w:r>
+            <w:proofErr w:type="spellStart"/>
+            <w:r>
+              <w:rPr>
+                <w:sz w:val="18"/>
+                <w:szCs w:val="18"/>
+              </w:rPr>
+              <w:t>NegC</w:t>
+            </w:r>
+            <w:proofErr w:type="spellEnd"/>
+            <w:r>
+              <w:rPr>
+                <w:sz w:val="18"/>
+                <w:szCs w:val="18"/>
+              </w:rPr>
+              <w:t>}</w:t>
             </w:r>
           </w:p>
         </w:tc>
@@ -693,7 +647,23 @@
                 <w:sz w:val="18"/>
                 <w:szCs w:val="18"/>
               </w:rPr>
-              <w:t>{NeuP}%</w:t>
+              <w:t>{</w:t>
+            </w:r>
+            <w:proofErr w:type="spellStart"/>
+            <w:r>
+              <w:rPr>
+                <w:sz w:val="18"/>
+                <w:szCs w:val="18"/>
+              </w:rPr>
+              <w:t>NeuP</w:t>
+            </w:r>
+            <w:proofErr w:type="spellEnd"/>
+            <w:r>
+              <w:rPr>
+                <w:sz w:val="18"/>
+                <w:szCs w:val="18"/>
+              </w:rPr>
+              <w:t>}%</w:t>
             </w:r>
           </w:p>
         </w:tc>
@@ -714,7 +684,23 @@
                 <w:sz w:val="18"/>
                 <w:szCs w:val="18"/>
               </w:rPr>
-              <w:t>{NeuC}</w:t>
+              <w:t>{</w:t>
+            </w:r>
+            <w:proofErr w:type="spellStart"/>
+            <w:r>
+              <w:rPr>
+                <w:sz w:val="18"/>
+                <w:szCs w:val="18"/>
+              </w:rPr>
+              <w:t>NeuC</w:t>
+            </w:r>
+            <w:proofErr w:type="spellEnd"/>
+            <w:r>
+              <w:rPr>
+                <w:sz w:val="18"/>
+                <w:szCs w:val="18"/>
+              </w:rPr>
+              <w:t>}</w:t>
             </w:r>
           </w:p>
         </w:tc>
@@ -735,7 +721,23 @@
                 <w:sz w:val="18"/>
                 <w:szCs w:val="18"/>
               </w:rPr>
-              <w:t>{posP}</w:t>
+              <w:t>{</w:t>
+            </w:r>
+            <w:proofErr w:type="spellStart"/>
+            <w:r>
+              <w:rPr>
+                <w:sz w:val="18"/>
+                <w:szCs w:val="18"/>
+              </w:rPr>
+              <w:t>posP</w:t>
+            </w:r>
+            <w:proofErr w:type="spellEnd"/>
+            <w:r>
+              <w:rPr>
+                <w:sz w:val="18"/>
+                <w:szCs w:val="18"/>
+              </w:rPr>
+              <w:t>}%</w:t>
             </w:r>
           </w:p>
         </w:tc>
@@ -756,7 +758,23 @@
                 <w:sz w:val="18"/>
                 <w:szCs w:val="18"/>
               </w:rPr>
-              <w:t>{posC}</w:t>
+              <w:t>{</w:t>
+            </w:r>
+            <w:proofErr w:type="spellStart"/>
+            <w:r>
+              <w:rPr>
+                <w:sz w:val="18"/>
+                <w:szCs w:val="18"/>
+              </w:rPr>
+              <w:t>posC</w:t>
+            </w:r>
+            <w:proofErr w:type="spellEnd"/>
+            <w:r>
+              <w:rPr>
+                <w:sz w:val="18"/>
+                <w:szCs w:val="18"/>
+              </w:rPr>
+              <w:t>}</w:t>
             </w:r>
           </w:p>
         </w:tc>
@@ -834,7 +852,21 @@
                 <w:sz w:val="18"/>
                 <w:szCs w:val="18"/>
               </w:rPr>
-              <w:t>{NegC}</w:t>
+              <w:t>{NegC</w:t>
+            </w:r>
+            <w:r>
+              <w:rPr>
+                <w:sz w:val="18"/>
+                <w:szCs w:val="18"/>
+              </w:rPr>
+              <w:t>2</w:t>
+            </w:r>
+            <w:r>
+              <w:rPr>
+                <w:sz w:val="18"/>
+                <w:szCs w:val="18"/>
+              </w:rPr>
+              <w:t>}</w:t>
             </w:r>
           </w:p>
         </w:tc>
@@ -898,6 +930,13 @@
                 <w:szCs w:val="18"/>
               </w:rPr>
               <w:t>{posP2}</w:t>
+            </w:r>
+            <w:r>
+              <w:rPr>
+                <w:sz w:val="18"/>
+                <w:szCs w:val="18"/>
+              </w:rPr>
+              <w:t>%</w:t>
             </w:r>
           </w:p>
         </w:tc>
@@ -926,7 +965,360 @@
     </w:tbl>
     <w:p/>
     <w:p>
+      <w:pPr>
+        <w:rPr>
+          <w:b/>
+          <w:bCs/>
+        </w:rPr>
+      </w:pPr>
       <w:r>
+        <w:rPr>
+          <w:b/>
+          <w:bCs/>
+        </w:rPr>
+        <w:t>Sentiment By Gender</w:t>
+      </w:r>
+      <w:r>
+        <w:rPr>
+          <w:b/>
+          <w:bCs/>
+        </w:rPr>
+        <w:t xml:space="preserve"> Tooltip Summary</w:t>
+      </w:r>
+      <w:r>
+        <w:rPr>
+          <w:b/>
+          <w:bCs/>
+        </w:rPr>
+        <w:t>:</w:t>
+      </w:r>
+    </w:p>
+    <w:tbl>
+      <w:tblPr>
+        <w:tblStyle w:val="TableGrid"/>
+        <w:tblW w:w="0" w:type="auto"/>
+        <w:tblLook w:val="04A0" w:firstRow="1" w:lastRow="0" w:firstColumn="1" w:lastColumn="0" w:noHBand="0" w:noVBand="1"/>
+      </w:tblPr>
+      <w:tblGrid>
+        <w:gridCol w:w="1531"/>
+        <w:gridCol w:w="2952"/>
+        <w:gridCol w:w="2406"/>
+        <w:gridCol w:w="2461"/>
+      </w:tblGrid>
+      <w:tr>
+        <w:tc>
+          <w:tcPr>
+            <w:tcW w:w="1554" w:type="dxa"/>
+          </w:tcPr>
+          <w:p>
+            <w:pPr>
+              <w:rPr>
+                <w:sz w:val="18"/>
+                <w:szCs w:val="18"/>
+              </w:rPr>
+            </w:pPr>
+          </w:p>
+        </w:tc>
+        <w:tc>
+          <w:tcPr>
+            <w:tcW w:w="3169" w:type="dxa"/>
+          </w:tcPr>
+          <w:p>
+            <w:pPr>
+              <w:jc w:val="center"/>
+              <w:rPr>
+                <w:b/>
+                <w:bCs/>
+                <w:sz w:val="20"/>
+                <w:szCs w:val="20"/>
+              </w:rPr>
+            </w:pPr>
+            <w:r>
+              <w:rPr>
+                <w:b/>
+                <w:bCs/>
+                <w:sz w:val="20"/>
+                <w:szCs w:val="20"/>
+              </w:rPr>
+              <w:t>Negative</w:t>
+            </w:r>
+          </w:p>
+        </w:tc>
+        <w:tc>
+          <w:tcPr>
+            <w:tcW w:w="2313" w:type="dxa"/>
+          </w:tcPr>
+          <w:p>
+            <w:pPr>
+              <w:jc w:val="center"/>
+              <w:rPr>
+                <w:b/>
+                <w:bCs/>
+                <w:sz w:val="20"/>
+                <w:szCs w:val="20"/>
+              </w:rPr>
+            </w:pPr>
+            <w:r>
+              <w:rPr>
+                <w:b/>
+                <w:bCs/>
+                <w:sz w:val="20"/>
+                <w:szCs w:val="20"/>
+              </w:rPr>
+              <w:t>Neutral</w:t>
+            </w:r>
+          </w:p>
+        </w:tc>
+        <w:tc>
+          <w:tcPr>
+            <w:tcW w:w="2314" w:type="dxa"/>
+          </w:tcPr>
+          <w:p>
+            <w:pPr>
+              <w:jc w:val="center"/>
+              <w:rPr>
+                <w:b/>
+                <w:bCs/>
+                <w:sz w:val="20"/>
+                <w:szCs w:val="20"/>
+              </w:rPr>
+            </w:pPr>
+            <w:r>
+              <w:rPr>
+                <w:b/>
+                <w:bCs/>
+                <w:sz w:val="20"/>
+                <w:szCs w:val="20"/>
+              </w:rPr>
+              <w:t>Positive</w:t>
+            </w:r>
+          </w:p>
+        </w:tc>
+      </w:tr>
+      <w:tr>
+        <w:tc>
+          <w:tcPr>
+            <w:tcW w:w="1554" w:type="dxa"/>
+          </w:tcPr>
+          <w:p>
+            <w:r>
+              <w:rPr>
+                <w:sz w:val="18"/>
+                <w:szCs w:val="18"/>
+              </w:rPr>
+              <w:t>{gender_name1}</w:t>
+            </w:r>
+          </w:p>
+        </w:tc>
+        <w:tc>
+          <w:tcPr>
+            <w:tcW w:w="3169" w:type="dxa"/>
+          </w:tcPr>
+          <w:p>
+            <w:pPr>
+              <w:rPr>
+                <w:sz w:val="18"/>
+                <w:szCs w:val="18"/>
+              </w:rPr>
+            </w:pPr>
+            <w:r>
+              <w:rPr>
+                <w:sz w:val="18"/>
+                <w:szCs w:val="18"/>
+              </w:rPr>
+              <w:t>{gender_summary_negative1}</w:t>
+            </w:r>
+          </w:p>
+        </w:tc>
+        <w:tc>
+          <w:tcPr>
+            <w:tcW w:w="2313" w:type="dxa"/>
+          </w:tcPr>
+          <w:p>
+            <w:pPr>
+              <w:rPr>
+                <w:sz w:val="18"/>
+                <w:szCs w:val="18"/>
+              </w:rPr>
+            </w:pPr>
+            <w:r>
+              <w:rPr>
+                <w:sz w:val="18"/>
+                <w:szCs w:val="18"/>
+              </w:rPr>
+              <w:t>{gender_summary_neutral1}</w:t>
+            </w:r>
+          </w:p>
+          <w:p>
+            <w:pPr>
+              <w:rPr>
+                <w:sz w:val="18"/>
+                <w:szCs w:val="18"/>
+              </w:rPr>
+            </w:pPr>
+          </w:p>
+        </w:tc>
+        <w:tc>
+          <w:tcPr>
+            <w:tcW w:w="2314" w:type="dxa"/>
+          </w:tcPr>
+          <w:p>
+            <w:pPr>
+              <w:rPr>
+                <w:sz w:val="18"/>
+                <w:szCs w:val="18"/>
+              </w:rPr>
+            </w:pPr>
+            <w:r>
+              <w:rPr>
+                <w:sz w:val="18"/>
+                <w:szCs w:val="18"/>
+              </w:rPr>
+              <w:t>{gender_summary_positive</w:t>
+            </w:r>
+            <w:r>
+              <w:rPr>
+                <w:sz w:val="18"/>
+                <w:szCs w:val="18"/>
+              </w:rPr>
+              <w:t>1</w:t>
+            </w:r>
+            <w:r>
+              <w:rPr>
+                <w:sz w:val="18"/>
+                <w:szCs w:val="18"/>
+              </w:rPr>
+              <w:t>}</w:t>
+            </w:r>
+          </w:p>
+        </w:tc>
+      </w:tr>
+      <w:tr>
+        <w:tc>
+          <w:tcPr>
+            <w:tcW w:w="1554" w:type="dxa"/>
+          </w:tcPr>
+          <w:p>
+            <w:r>
+              <w:rPr>
+                <w:sz w:val="18"/>
+                <w:szCs w:val="18"/>
+              </w:rPr>
+              <w:t>{gender_name2}</w:t>
+            </w:r>
+          </w:p>
+        </w:tc>
+        <w:tc>
+          <w:tcPr>
+            <w:tcW w:w="3169" w:type="dxa"/>
+          </w:tcPr>
+          <w:p>
+            <w:pPr>
+              <w:rPr>
+                <w:sz w:val="18"/>
+                <w:szCs w:val="18"/>
+              </w:rPr>
+            </w:pPr>
+            <w:r>
+              <w:rPr>
+                <w:sz w:val="18"/>
+                <w:szCs w:val="18"/>
+              </w:rPr>
+              <w:t>{gender_summary_negative</w:t>
+            </w:r>
+            <w:r>
+              <w:rPr>
+                <w:sz w:val="18"/>
+                <w:szCs w:val="18"/>
+              </w:rPr>
+              <w:t>2</w:t>
+            </w:r>
+            <w:r>
+              <w:rPr>
+                <w:sz w:val="18"/>
+                <w:szCs w:val="18"/>
+              </w:rPr>
+              <w:t>}</w:t>
+            </w:r>
+          </w:p>
+          <w:p>
+            <w:pPr>
+              <w:rPr>
+                <w:sz w:val="18"/>
+                <w:szCs w:val="18"/>
+              </w:rPr>
+            </w:pPr>
+          </w:p>
+        </w:tc>
+        <w:tc>
+          <w:tcPr>
+            <w:tcW w:w="2313" w:type="dxa"/>
+          </w:tcPr>
+          <w:p>
+            <w:pPr>
+              <w:rPr>
+                <w:sz w:val="18"/>
+                <w:szCs w:val="18"/>
+              </w:rPr>
+            </w:pPr>
+            <w:r>
+              <w:rPr>
+                <w:sz w:val="18"/>
+                <w:szCs w:val="18"/>
+              </w:rPr>
+              <w:t>{gender_summary_neutral</w:t>
+            </w:r>
+            <w:r>
+              <w:rPr>
+                <w:sz w:val="18"/>
+                <w:szCs w:val="18"/>
+              </w:rPr>
+              <w:t>2</w:t>
+            </w:r>
+            <w:r>
+              <w:rPr>
+                <w:sz w:val="18"/>
+                <w:szCs w:val="18"/>
+              </w:rPr>
+              <w:t>}</w:t>
+            </w:r>
+          </w:p>
+        </w:tc>
+        <w:tc>
+          <w:tcPr>
+            <w:tcW w:w="2314" w:type="dxa"/>
+          </w:tcPr>
+          <w:p>
+            <w:pPr>
+              <w:rPr>
+                <w:sz w:val="18"/>
+                <w:szCs w:val="18"/>
+              </w:rPr>
+            </w:pPr>
+            <w:r>
+              <w:rPr>
+                <w:sz w:val="18"/>
+                <w:szCs w:val="18"/>
+              </w:rPr>
+              <w:t>{gender_summary_positive2}</w:t>
+            </w:r>
+          </w:p>
+        </w:tc>
+      </w:tr>
+    </w:tbl>
+    <w:p/>
+    <w:p>
+      <w:pPr>
+        <w:rPr>
+          <w:b/>
+          <w:bCs/>
+        </w:rPr>
+      </w:pPr>
+      <w:r>
+        <w:rPr>
+          <w:b/>
+          <w:bCs/>
+        </w:rPr>
         <w:t>Sentiment By Service:</w:t>
       </w:r>
     </w:p>
@@ -937,8 +1329,8 @@
         <w:tblLook w:val="04A0" w:firstRow="1" w:lastRow="0" w:firstColumn="1" w:lastColumn="0" w:noHBand="0" w:noVBand="1"/>
       </w:tblPr>
       <w:tblGrid>
-        <w:gridCol w:w="1705"/>
-        <w:gridCol w:w="1269"/>
+        <w:gridCol w:w="1555"/>
+        <w:gridCol w:w="1419"/>
         <w:gridCol w:w="1483"/>
         <w:gridCol w:w="1458"/>
         <w:gridCol w:w="1211"/>
@@ -948,21 +1340,21 @@
       <w:tr>
         <w:tc>
           <w:tcPr>
-            <w:tcW w:w="1705" w:type="dxa"/>
-          </w:tcPr>
-          <w:p>
-            <w:pPr>
-              <w:jc w:val="center"/>
-              <w:rPr>
-                <w:sz w:val="18"/>
-                <w:szCs w:val="18"/>
-              </w:rPr>
-            </w:pPr>
-          </w:p>
-        </w:tc>
-        <w:tc>
-          <w:tcPr>
-            <w:tcW w:w="1269" w:type="dxa"/>
+            <w:tcW w:w="1555" w:type="dxa"/>
+          </w:tcPr>
+          <w:p>
+            <w:pPr>
+              <w:jc w:val="center"/>
+              <w:rPr>
+                <w:sz w:val="18"/>
+                <w:szCs w:val="18"/>
+              </w:rPr>
+            </w:pPr>
+          </w:p>
+        </w:tc>
+        <w:tc>
+          <w:tcPr>
+            <w:tcW w:w="1419" w:type="dxa"/>
           </w:tcPr>
           <w:p>
             <w:pPr>
@@ -1090,7 +1482,7 @@
       <w:tr>
         <w:tc>
           <w:tcPr>
-            <w:tcW w:w="1705" w:type="dxa"/>
+            <w:tcW w:w="1555" w:type="dxa"/>
           </w:tcPr>
           <w:p>
             <w:pPr>
@@ -1124,7 +1516,7 @@
         </w:tc>
         <w:tc>
           <w:tcPr>
-            <w:tcW w:w="1269" w:type="dxa"/>
+            <w:tcW w:w="1419" w:type="dxa"/>
           </w:tcPr>
           <w:p>
             <w:pPr>
@@ -1160,21 +1552,7 @@
                 <w:sz w:val="18"/>
                 <w:szCs w:val="18"/>
               </w:rPr>
-              <w:t>{sNeg</w:t>
-            </w:r>
-            <w:r>
-              <w:rPr>
-                <w:sz w:val="18"/>
-                <w:szCs w:val="18"/>
-              </w:rPr>
-              <w:t>C</w:t>
-            </w:r>
-            <w:r>
-              <w:rPr>
-                <w:sz w:val="18"/>
-                <w:szCs w:val="18"/>
-              </w:rPr>
-              <w:t>1}</w:t>
+              <w:t>{sNegC1}</w:t>
             </w:r>
           </w:p>
         </w:tc>
@@ -1195,28 +1573,7 @@
                 <w:sz w:val="18"/>
                 <w:szCs w:val="18"/>
               </w:rPr>
-              <w:t>{sNe</w:t>
-            </w:r>
-            <w:r>
-              <w:rPr>
-                <w:sz w:val="18"/>
-                <w:szCs w:val="18"/>
-              </w:rPr>
-              <w:t>uP</w:t>
-            </w:r>
-            <w:r>
-              <w:rPr>
-                <w:sz w:val="18"/>
-                <w:szCs w:val="18"/>
-              </w:rPr>
-              <w:t>1}</w:t>
-            </w:r>
-            <w:r>
-              <w:rPr>
-                <w:sz w:val="18"/>
-                <w:szCs w:val="18"/>
-              </w:rPr>
-              <w:t>%</w:t>
+              <w:t>{sNeuP1}%</w:t>
             </w:r>
           </w:p>
         </w:tc>
@@ -1237,21 +1594,7 @@
                 <w:sz w:val="18"/>
                 <w:szCs w:val="18"/>
               </w:rPr>
-              <w:t>{sNeu</w:t>
-            </w:r>
-            <w:r>
-              <w:rPr>
-                <w:sz w:val="18"/>
-                <w:szCs w:val="18"/>
-              </w:rPr>
-              <w:t>C</w:t>
-            </w:r>
-            <w:r>
-              <w:rPr>
-                <w:sz w:val="18"/>
-                <w:szCs w:val="18"/>
-              </w:rPr>
-              <w:t>1}</w:t>
+              <w:t>{sNeuC1}</w:t>
             </w:r>
           </w:p>
         </w:tc>
@@ -1272,28 +1615,7 @@
                 <w:sz w:val="18"/>
                 <w:szCs w:val="18"/>
               </w:rPr>
-              <w:t>{s</w:t>
-            </w:r>
-            <w:r>
-              <w:rPr>
-                <w:sz w:val="18"/>
-                <w:szCs w:val="18"/>
-              </w:rPr>
-              <w:t>PosP</w:t>
-            </w:r>
-            <w:r>
-              <w:rPr>
-                <w:sz w:val="18"/>
-                <w:szCs w:val="18"/>
-              </w:rPr>
-              <w:t>1}</w:t>
-            </w:r>
-            <w:r>
-              <w:rPr>
-                <w:sz w:val="18"/>
-                <w:szCs w:val="18"/>
-              </w:rPr>
-              <w:t>%</w:t>
+              <w:t>{sPosP1}%</w:t>
             </w:r>
           </w:p>
         </w:tc>
@@ -1314,21 +1636,7 @@
                 <w:sz w:val="18"/>
                 <w:szCs w:val="18"/>
               </w:rPr>
-              <w:t>{sPos</w:t>
-            </w:r>
-            <w:r>
-              <w:rPr>
-                <w:sz w:val="18"/>
-                <w:szCs w:val="18"/>
-              </w:rPr>
-              <w:t>C</w:t>
-            </w:r>
-            <w:r>
-              <w:rPr>
-                <w:sz w:val="18"/>
-                <w:szCs w:val="18"/>
-              </w:rPr>
-              <w:t>1}</w:t>
+              <w:t>{sPosC1}</w:t>
             </w:r>
           </w:p>
         </w:tc>
@@ -1336,7 +1644,7 @@
       <w:tr>
         <w:tc>
           <w:tcPr>
-            <w:tcW w:w="1705" w:type="dxa"/>
+            <w:tcW w:w="1555" w:type="dxa"/>
           </w:tcPr>
           <w:p>
             <w:pPr>
@@ -1364,56 +1672,28 @@
                 <w:sz w:val="18"/>
                 <w:szCs w:val="18"/>
               </w:rPr>
-              <w:t>2</w:t>
-            </w:r>
-            <w:r>
-              <w:rPr>
-                <w:sz w:val="18"/>
-                <w:szCs w:val="18"/>
-              </w:rPr>
-              <w:t>}</w:t>
-            </w:r>
-          </w:p>
-        </w:tc>
-        <w:tc>
-          <w:tcPr>
-            <w:tcW w:w="1269" w:type="dxa"/>
-          </w:tcPr>
-          <w:p>
-            <w:pPr>
-              <w:jc w:val="center"/>
-              <w:rPr>
-                <w:sz w:val="18"/>
-                <w:szCs w:val="18"/>
-              </w:rPr>
-            </w:pPr>
-            <w:r>
-              <w:rPr>
-                <w:sz w:val="18"/>
-                <w:szCs w:val="18"/>
-              </w:rPr>
-              <w:t>{sNegP</w:t>
-            </w:r>
-            <w:r>
-              <w:rPr>
-                <w:sz w:val="18"/>
-                <w:szCs w:val="18"/>
-              </w:rPr>
-              <w:t>2</w:t>
-            </w:r>
-            <w:r>
-              <w:rPr>
-                <w:sz w:val="18"/>
-                <w:szCs w:val="18"/>
-              </w:rPr>
-              <w:t>}</w:t>
-            </w:r>
-            <w:r>
-              <w:rPr>
-                <w:sz w:val="18"/>
-                <w:szCs w:val="18"/>
-              </w:rPr>
-              <w:t>%</w:t>
+              <w:t>2}</w:t>
+            </w:r>
+          </w:p>
+        </w:tc>
+        <w:tc>
+          <w:tcPr>
+            <w:tcW w:w="1419" w:type="dxa"/>
+          </w:tcPr>
+          <w:p>
+            <w:pPr>
+              <w:jc w:val="center"/>
+              <w:rPr>
+                <w:sz w:val="18"/>
+                <w:szCs w:val="18"/>
+              </w:rPr>
+            </w:pPr>
+            <w:r>
+              <w:rPr>
+                <w:sz w:val="18"/>
+                <w:szCs w:val="18"/>
+              </w:rPr>
+              <w:t>{sNegP2}%</w:t>
             </w:r>
           </w:p>
         </w:tc>
@@ -1434,21 +1714,7 @@
                 <w:sz w:val="18"/>
                 <w:szCs w:val="18"/>
               </w:rPr>
-              <w:t>{sNegC</w:t>
-            </w:r>
-            <w:r>
-              <w:rPr>
-                <w:sz w:val="18"/>
-                <w:szCs w:val="18"/>
-              </w:rPr>
-              <w:t>2</w:t>
-            </w:r>
-            <w:r>
-              <w:rPr>
-                <w:sz w:val="18"/>
-                <w:szCs w:val="18"/>
-              </w:rPr>
-              <w:t>}</w:t>
+              <w:t>{sNegC2}</w:t>
             </w:r>
           </w:p>
         </w:tc>
@@ -1469,28 +1735,7 @@
                 <w:sz w:val="18"/>
                 <w:szCs w:val="18"/>
               </w:rPr>
-              <w:t>{sNeuP</w:t>
-            </w:r>
-            <w:r>
-              <w:rPr>
-                <w:sz w:val="18"/>
-                <w:szCs w:val="18"/>
-              </w:rPr>
-              <w:t>2</w:t>
-            </w:r>
-            <w:r>
-              <w:rPr>
-                <w:sz w:val="18"/>
-                <w:szCs w:val="18"/>
-              </w:rPr>
-              <w:t>}</w:t>
-            </w:r>
-            <w:r>
-              <w:rPr>
-                <w:sz w:val="18"/>
-                <w:szCs w:val="18"/>
-              </w:rPr>
-              <w:t>%</w:t>
+              <w:t>{sNeuP2}%</w:t>
             </w:r>
           </w:p>
         </w:tc>
@@ -1511,21 +1756,7 @@
                 <w:sz w:val="18"/>
                 <w:szCs w:val="18"/>
               </w:rPr>
-              <w:t>{sNeuC</w:t>
-            </w:r>
-            <w:r>
-              <w:rPr>
-                <w:sz w:val="18"/>
-                <w:szCs w:val="18"/>
-              </w:rPr>
-              <w:t>2</w:t>
-            </w:r>
-            <w:r>
-              <w:rPr>
-                <w:sz w:val="18"/>
-                <w:szCs w:val="18"/>
-              </w:rPr>
-              <w:t>}</w:t>
+              <w:t>{sNeuC2}</w:t>
             </w:r>
           </w:p>
         </w:tc>
@@ -1546,28 +1777,7 @@
                 <w:sz w:val="18"/>
                 <w:szCs w:val="18"/>
               </w:rPr>
-              <w:t>{sPosP</w:t>
-            </w:r>
-            <w:r>
-              <w:rPr>
-                <w:sz w:val="18"/>
-                <w:szCs w:val="18"/>
-              </w:rPr>
-              <w:t>2</w:t>
-            </w:r>
-            <w:r>
-              <w:rPr>
-                <w:sz w:val="18"/>
-                <w:szCs w:val="18"/>
-              </w:rPr>
-              <w:t>}</w:t>
-            </w:r>
-            <w:r>
-              <w:rPr>
-                <w:sz w:val="18"/>
-                <w:szCs w:val="18"/>
-              </w:rPr>
-              <w:t>%</w:t>
+              <w:t>{sPosP2}%</w:t>
             </w:r>
           </w:p>
         </w:tc>
@@ -1588,21 +1798,7 @@
                 <w:sz w:val="18"/>
                 <w:szCs w:val="18"/>
               </w:rPr>
-              <w:t>{sPos</w:t>
-            </w:r>
-            <w:r>
-              <w:rPr>
-                <w:sz w:val="18"/>
-                <w:szCs w:val="18"/>
-              </w:rPr>
-              <w:t>C2</w:t>
-            </w:r>
-            <w:r>
-              <w:rPr>
-                <w:sz w:val="18"/>
-                <w:szCs w:val="18"/>
-              </w:rPr>
-              <w:t>}</w:t>
+              <w:t>{sPosC2}</w:t>
             </w:r>
           </w:p>
         </w:tc>
@@ -1610,7 +1806,7 @@
       <w:tr>
         <w:tc>
           <w:tcPr>
-            <w:tcW w:w="1705" w:type="dxa"/>
+            <w:tcW w:w="1555" w:type="dxa"/>
           </w:tcPr>
           <w:p>
             <w:pPr>
@@ -1638,56 +1834,28 @@
                 <w:sz w:val="18"/>
                 <w:szCs w:val="18"/>
               </w:rPr>
-              <w:t>3</w:t>
-            </w:r>
-            <w:r>
-              <w:rPr>
-                <w:sz w:val="18"/>
-                <w:szCs w:val="18"/>
-              </w:rPr>
-              <w:t>}</w:t>
-            </w:r>
-          </w:p>
-        </w:tc>
-        <w:tc>
-          <w:tcPr>
-            <w:tcW w:w="1269" w:type="dxa"/>
-          </w:tcPr>
-          <w:p>
-            <w:pPr>
-              <w:jc w:val="center"/>
-              <w:rPr>
-                <w:sz w:val="18"/>
-                <w:szCs w:val="18"/>
-              </w:rPr>
-            </w:pPr>
-            <w:r>
-              <w:rPr>
-                <w:sz w:val="18"/>
-                <w:szCs w:val="18"/>
-              </w:rPr>
-              <w:t>{sNegP</w:t>
-            </w:r>
-            <w:r>
-              <w:rPr>
-                <w:sz w:val="18"/>
-                <w:szCs w:val="18"/>
-              </w:rPr>
-              <w:t>3</w:t>
-            </w:r>
-            <w:r>
-              <w:rPr>
-                <w:sz w:val="18"/>
-                <w:szCs w:val="18"/>
-              </w:rPr>
-              <w:t>}</w:t>
-            </w:r>
-            <w:r>
-              <w:rPr>
-                <w:sz w:val="18"/>
-                <w:szCs w:val="18"/>
-              </w:rPr>
-              <w:t>%</w:t>
+              <w:t>3}</w:t>
+            </w:r>
+          </w:p>
+        </w:tc>
+        <w:tc>
+          <w:tcPr>
+            <w:tcW w:w="1419" w:type="dxa"/>
+          </w:tcPr>
+          <w:p>
+            <w:pPr>
+              <w:jc w:val="center"/>
+              <w:rPr>
+                <w:sz w:val="18"/>
+                <w:szCs w:val="18"/>
+              </w:rPr>
+            </w:pPr>
+            <w:r>
+              <w:rPr>
+                <w:sz w:val="18"/>
+                <w:szCs w:val="18"/>
+              </w:rPr>
+              <w:t>{sNegP3}%</w:t>
             </w:r>
           </w:p>
         </w:tc>
@@ -1708,21 +1876,7 @@
                 <w:sz w:val="18"/>
                 <w:szCs w:val="18"/>
               </w:rPr>
-              <w:t>{sNegC</w:t>
-            </w:r>
-            <w:r>
-              <w:rPr>
-                <w:sz w:val="18"/>
-                <w:szCs w:val="18"/>
-              </w:rPr>
-              <w:t>3</w:t>
-            </w:r>
-            <w:r>
-              <w:rPr>
-                <w:sz w:val="18"/>
-                <w:szCs w:val="18"/>
-              </w:rPr>
-              <w:t>}</w:t>
+              <w:t>{sNegC3}</w:t>
             </w:r>
           </w:p>
         </w:tc>
@@ -1743,28 +1897,7 @@
                 <w:sz w:val="18"/>
                 <w:szCs w:val="18"/>
               </w:rPr>
-              <w:t>{sNeuP</w:t>
-            </w:r>
-            <w:r>
-              <w:rPr>
-                <w:sz w:val="18"/>
-                <w:szCs w:val="18"/>
-              </w:rPr>
-              <w:t>3</w:t>
-            </w:r>
-            <w:r>
-              <w:rPr>
-                <w:sz w:val="18"/>
-                <w:szCs w:val="18"/>
-              </w:rPr>
-              <w:t>}</w:t>
-            </w:r>
-            <w:r>
-              <w:rPr>
-                <w:sz w:val="18"/>
-                <w:szCs w:val="18"/>
-              </w:rPr>
-              <w:t>%</w:t>
+              <w:t>{sNeuP3}%</w:t>
             </w:r>
           </w:p>
         </w:tc>
@@ -1785,21 +1918,7 @@
                 <w:sz w:val="18"/>
                 <w:szCs w:val="18"/>
               </w:rPr>
-              <w:t>{sNeuC</w:t>
-            </w:r>
-            <w:r>
-              <w:rPr>
-                <w:sz w:val="18"/>
-                <w:szCs w:val="18"/>
-              </w:rPr>
-              <w:t>3</w:t>
-            </w:r>
-            <w:r>
-              <w:rPr>
-                <w:sz w:val="18"/>
-                <w:szCs w:val="18"/>
-              </w:rPr>
-              <w:t>}</w:t>
+              <w:t>{sNeuC3}</w:t>
             </w:r>
           </w:p>
         </w:tc>
@@ -1820,28 +1939,7 @@
                 <w:sz w:val="18"/>
                 <w:szCs w:val="18"/>
               </w:rPr>
-              <w:t>{sPosP</w:t>
-            </w:r>
-            <w:r>
-              <w:rPr>
-                <w:sz w:val="18"/>
-                <w:szCs w:val="18"/>
-              </w:rPr>
-              <w:t>3</w:t>
-            </w:r>
-            <w:r>
-              <w:rPr>
-                <w:sz w:val="18"/>
-                <w:szCs w:val="18"/>
-              </w:rPr>
-              <w:t>}</w:t>
-            </w:r>
-            <w:r>
-              <w:rPr>
-                <w:sz w:val="18"/>
-                <w:szCs w:val="18"/>
-              </w:rPr>
-              <w:t>%</w:t>
+              <w:t>{sPosP3}%</w:t>
             </w:r>
           </w:p>
         </w:tc>
@@ -1862,21 +1960,7 @@
                 <w:sz w:val="18"/>
                 <w:szCs w:val="18"/>
               </w:rPr>
-              <w:t>{sPos</w:t>
-            </w:r>
-            <w:r>
-              <w:rPr>
-                <w:sz w:val="18"/>
-                <w:szCs w:val="18"/>
-              </w:rPr>
-              <w:t>C3</w:t>
-            </w:r>
-            <w:r>
-              <w:rPr>
-                <w:sz w:val="18"/>
-                <w:szCs w:val="18"/>
-              </w:rPr>
-              <w:t>}</w:t>
+              <w:t>{sPosC3}</w:t>
             </w:r>
           </w:p>
         </w:tc>
@@ -1884,7 +1968,7 @@
       <w:tr>
         <w:tc>
           <w:tcPr>
-            <w:tcW w:w="1705" w:type="dxa"/>
+            <w:tcW w:w="1555" w:type="dxa"/>
           </w:tcPr>
           <w:p>
             <w:pPr>
@@ -1912,56 +1996,28 @@
                 <w:sz w:val="18"/>
                 <w:szCs w:val="18"/>
               </w:rPr>
-              <w:t>4</w:t>
-            </w:r>
-            <w:r>
-              <w:rPr>
-                <w:sz w:val="18"/>
-                <w:szCs w:val="18"/>
-              </w:rPr>
-              <w:t>}</w:t>
-            </w:r>
-          </w:p>
-        </w:tc>
-        <w:tc>
-          <w:tcPr>
-            <w:tcW w:w="1269" w:type="dxa"/>
-          </w:tcPr>
-          <w:p>
-            <w:pPr>
-              <w:jc w:val="center"/>
-              <w:rPr>
-                <w:sz w:val="18"/>
-                <w:szCs w:val="18"/>
-              </w:rPr>
-            </w:pPr>
-            <w:r>
-              <w:rPr>
-                <w:sz w:val="18"/>
-                <w:szCs w:val="18"/>
-              </w:rPr>
-              <w:t>{sNegP</w:t>
-            </w:r>
-            <w:r>
-              <w:rPr>
-                <w:sz w:val="18"/>
-                <w:szCs w:val="18"/>
-              </w:rPr>
-              <w:t>4</w:t>
-            </w:r>
-            <w:r>
-              <w:rPr>
-                <w:sz w:val="18"/>
-                <w:szCs w:val="18"/>
-              </w:rPr>
-              <w:t>}</w:t>
-            </w:r>
-            <w:r>
-              <w:rPr>
-                <w:sz w:val="18"/>
-                <w:szCs w:val="18"/>
-              </w:rPr>
-              <w:t>%</w:t>
+              <w:t>4}</w:t>
+            </w:r>
+          </w:p>
+        </w:tc>
+        <w:tc>
+          <w:tcPr>
+            <w:tcW w:w="1419" w:type="dxa"/>
+          </w:tcPr>
+          <w:p>
+            <w:pPr>
+              <w:jc w:val="center"/>
+              <w:rPr>
+                <w:sz w:val="18"/>
+                <w:szCs w:val="18"/>
+              </w:rPr>
+            </w:pPr>
+            <w:r>
+              <w:rPr>
+                <w:sz w:val="18"/>
+                <w:szCs w:val="18"/>
+              </w:rPr>
+              <w:t>{sNegP4}%</w:t>
             </w:r>
           </w:p>
         </w:tc>
@@ -1982,21 +2038,7 @@
                 <w:sz w:val="18"/>
                 <w:szCs w:val="18"/>
               </w:rPr>
-              <w:t>{sNegC</w:t>
-            </w:r>
-            <w:r>
-              <w:rPr>
-                <w:sz w:val="18"/>
-                <w:szCs w:val="18"/>
-              </w:rPr>
-              <w:t>4</w:t>
-            </w:r>
-            <w:r>
-              <w:rPr>
-                <w:sz w:val="18"/>
-                <w:szCs w:val="18"/>
-              </w:rPr>
-              <w:t>}</w:t>
+              <w:t>{sNegC4}</w:t>
             </w:r>
           </w:p>
         </w:tc>
@@ -2017,28 +2059,7 @@
                 <w:sz w:val="18"/>
                 <w:szCs w:val="18"/>
               </w:rPr>
-              <w:t>{sNeuP</w:t>
-            </w:r>
-            <w:r>
-              <w:rPr>
-                <w:sz w:val="18"/>
-                <w:szCs w:val="18"/>
-              </w:rPr>
-              <w:t>4</w:t>
-            </w:r>
-            <w:r>
-              <w:rPr>
-                <w:sz w:val="18"/>
-                <w:szCs w:val="18"/>
-              </w:rPr>
-              <w:t>}</w:t>
-            </w:r>
-            <w:r>
-              <w:rPr>
-                <w:sz w:val="18"/>
-                <w:szCs w:val="18"/>
-              </w:rPr>
-              <w:t>%</w:t>
+              <w:t>{sNeuP4}%</w:t>
             </w:r>
           </w:p>
         </w:tc>
@@ -2059,21 +2080,7 @@
                 <w:sz w:val="18"/>
                 <w:szCs w:val="18"/>
               </w:rPr>
-              <w:t>{sNeuC</w:t>
-            </w:r>
-            <w:r>
-              <w:rPr>
-                <w:sz w:val="18"/>
-                <w:szCs w:val="18"/>
-              </w:rPr>
-              <w:t>4</w:t>
-            </w:r>
-            <w:r>
-              <w:rPr>
-                <w:sz w:val="18"/>
-                <w:szCs w:val="18"/>
-              </w:rPr>
-              <w:t>}</w:t>
+              <w:t>{sNeuC4}</w:t>
             </w:r>
           </w:p>
         </w:tc>
@@ -2094,28 +2101,7 @@
                 <w:sz w:val="18"/>
                 <w:szCs w:val="18"/>
               </w:rPr>
-              <w:t>{sPosP</w:t>
-            </w:r>
-            <w:r>
-              <w:rPr>
-                <w:sz w:val="18"/>
-                <w:szCs w:val="18"/>
-              </w:rPr>
-              <w:t>4</w:t>
-            </w:r>
-            <w:r>
-              <w:rPr>
-                <w:sz w:val="18"/>
-                <w:szCs w:val="18"/>
-              </w:rPr>
-              <w:t>}</w:t>
-            </w:r>
-            <w:r>
-              <w:rPr>
-                <w:sz w:val="18"/>
-                <w:szCs w:val="18"/>
-              </w:rPr>
-              <w:t>%</w:t>
+              <w:t>{sPosP4}%</w:t>
             </w:r>
           </w:p>
         </w:tc>
@@ -2136,21 +2122,7 @@
                 <w:sz w:val="18"/>
                 <w:szCs w:val="18"/>
               </w:rPr>
-              <w:t>{sPos</w:t>
-            </w:r>
-            <w:r>
-              <w:rPr>
-                <w:sz w:val="18"/>
-                <w:szCs w:val="18"/>
-              </w:rPr>
-              <w:t>C4</w:t>
-            </w:r>
-            <w:r>
-              <w:rPr>
-                <w:sz w:val="18"/>
-                <w:szCs w:val="18"/>
-              </w:rPr>
-              <w:t>}</w:t>
+              <w:t>{sPosC4}</w:t>
             </w:r>
           </w:p>
         </w:tc>
@@ -2158,220 +2130,1062 @@
     </w:tbl>
     <w:p/>
     <w:p>
+      <w:pPr>
+        <w:rPr>
+          <w:b/>
+          <w:bCs/>
+        </w:rPr>
+      </w:pPr>
+    </w:p>
+    <w:p>
+      <w:pPr>
+        <w:rPr>
+          <w:b/>
+          <w:bCs/>
+        </w:rPr>
+      </w:pPr>
+    </w:p>
+    <w:p>
+      <w:pPr>
+        <w:rPr>
+          <w:b/>
+          <w:bCs/>
+        </w:rPr>
+      </w:pPr>
       <w:r>
+        <w:rPr>
+          <w:b/>
+          <w:bCs/>
+        </w:rPr>
+        <w:t>Sentiment By Service Tooltip Summary:</w:t>
+      </w:r>
+    </w:p>
+    <w:tbl>
+      <w:tblPr>
+        <w:tblStyle w:val="TableGrid"/>
+        <w:tblW w:w="0" w:type="auto"/>
+        <w:tblLook w:val="04A0" w:firstRow="1" w:lastRow="0" w:firstColumn="1" w:lastColumn="0" w:noHBand="0" w:noVBand="1"/>
+      </w:tblPr>
+      <w:tblGrid>
+        <w:gridCol w:w="1532"/>
+        <w:gridCol w:w="2856"/>
+        <w:gridCol w:w="2481"/>
+        <w:gridCol w:w="2481"/>
+      </w:tblGrid>
+      <w:tr>
+        <w:tc>
+          <w:tcPr>
+            <w:tcW w:w="1532" w:type="dxa"/>
+          </w:tcPr>
+          <w:p>
+            <w:pPr>
+              <w:rPr>
+                <w:sz w:val="18"/>
+                <w:szCs w:val="18"/>
+              </w:rPr>
+            </w:pPr>
+          </w:p>
+        </w:tc>
+        <w:tc>
+          <w:tcPr>
+            <w:tcW w:w="2856" w:type="dxa"/>
+          </w:tcPr>
+          <w:p>
+            <w:pPr>
+              <w:jc w:val="center"/>
+              <w:rPr>
+                <w:b/>
+                <w:bCs/>
+                <w:sz w:val="20"/>
+                <w:szCs w:val="20"/>
+              </w:rPr>
+            </w:pPr>
+            <w:r>
+              <w:rPr>
+                <w:b/>
+                <w:bCs/>
+                <w:sz w:val="20"/>
+                <w:szCs w:val="20"/>
+              </w:rPr>
+              <w:t>Negative</w:t>
+            </w:r>
+          </w:p>
+        </w:tc>
+        <w:tc>
+          <w:tcPr>
+            <w:tcW w:w="2481" w:type="dxa"/>
+          </w:tcPr>
+          <w:p>
+            <w:pPr>
+              <w:jc w:val="center"/>
+              <w:rPr>
+                <w:b/>
+                <w:bCs/>
+                <w:sz w:val="20"/>
+                <w:szCs w:val="20"/>
+              </w:rPr>
+            </w:pPr>
+            <w:r>
+              <w:rPr>
+                <w:b/>
+                <w:bCs/>
+                <w:sz w:val="20"/>
+                <w:szCs w:val="20"/>
+              </w:rPr>
+              <w:t>Neutral</w:t>
+            </w:r>
+          </w:p>
+        </w:tc>
+        <w:tc>
+          <w:tcPr>
+            <w:tcW w:w="2481" w:type="dxa"/>
+          </w:tcPr>
+          <w:p>
+            <w:pPr>
+              <w:jc w:val="center"/>
+              <w:rPr>
+                <w:b/>
+                <w:bCs/>
+                <w:sz w:val="20"/>
+                <w:szCs w:val="20"/>
+              </w:rPr>
+            </w:pPr>
+            <w:r>
+              <w:rPr>
+                <w:b/>
+                <w:bCs/>
+                <w:sz w:val="20"/>
+                <w:szCs w:val="20"/>
+              </w:rPr>
+              <w:t>Positive</w:t>
+            </w:r>
+          </w:p>
+        </w:tc>
+      </w:tr>
+      <w:tr>
+        <w:tc>
+          <w:tcPr>
+            <w:tcW w:w="1532" w:type="dxa"/>
+          </w:tcPr>
+          <w:p>
+            <w:pPr>
+              <w:rPr>
+                <w:b/>
+                <w:bCs/>
+              </w:rPr>
+            </w:pPr>
+            <w:r>
+              <w:rPr>
+                <w:sz w:val="18"/>
+                <w:szCs w:val="18"/>
+              </w:rPr>
+              <w:t>{</w:t>
+            </w:r>
+            <w:r>
+              <w:rPr>
+                <w:sz w:val="18"/>
+                <w:szCs w:val="18"/>
+              </w:rPr>
+              <w:t>service_name1</w:t>
+            </w:r>
+            <w:r>
+              <w:rPr>
+                <w:sz w:val="18"/>
+                <w:szCs w:val="18"/>
+              </w:rPr>
+              <w:t>}</w:t>
+            </w:r>
+          </w:p>
+        </w:tc>
+        <w:tc>
+          <w:tcPr>
+            <w:tcW w:w="2856" w:type="dxa"/>
+          </w:tcPr>
+          <w:p>
+            <w:pPr>
+              <w:rPr>
+                <w:sz w:val="18"/>
+                <w:szCs w:val="18"/>
+              </w:rPr>
+            </w:pPr>
+            <w:r>
+              <w:rPr>
+                <w:sz w:val="18"/>
+                <w:szCs w:val="18"/>
+              </w:rPr>
+              <w:t>{service_summary_negative1}</w:t>
+            </w:r>
+          </w:p>
+          <w:p>
+            <w:pPr>
+              <w:rPr>
+                <w:b/>
+                <w:bCs/>
+                <w:sz w:val="18"/>
+                <w:szCs w:val="18"/>
+              </w:rPr>
+            </w:pPr>
+          </w:p>
+        </w:tc>
+        <w:tc>
+          <w:tcPr>
+            <w:tcW w:w="2481" w:type="dxa"/>
+          </w:tcPr>
+          <w:p>
+            <w:pPr>
+              <w:rPr>
+                <w:sz w:val="18"/>
+                <w:szCs w:val="18"/>
+              </w:rPr>
+            </w:pPr>
+            <w:r>
+              <w:rPr>
+                <w:sz w:val="18"/>
+                <w:szCs w:val="18"/>
+              </w:rPr>
+              <w:t>{service_summary_neutral1}</w:t>
+            </w:r>
+          </w:p>
+          <w:p>
+            <w:pPr>
+              <w:rPr>
+                <w:b/>
+                <w:bCs/>
+                <w:sz w:val="18"/>
+                <w:szCs w:val="18"/>
+              </w:rPr>
+            </w:pPr>
+          </w:p>
+        </w:tc>
+        <w:tc>
+          <w:tcPr>
+            <w:tcW w:w="2481" w:type="dxa"/>
+          </w:tcPr>
+          <w:p>
+            <w:pPr>
+              <w:rPr>
+                <w:sz w:val="18"/>
+                <w:szCs w:val="18"/>
+              </w:rPr>
+            </w:pPr>
+            <w:r>
+              <w:rPr>
+                <w:sz w:val="18"/>
+                <w:szCs w:val="18"/>
+              </w:rPr>
+              <w:t>{service_summary_positive1}</w:t>
+            </w:r>
+          </w:p>
+          <w:p>
+            <w:pPr>
+              <w:rPr>
+                <w:b/>
+                <w:bCs/>
+                <w:sz w:val="18"/>
+                <w:szCs w:val="18"/>
+              </w:rPr>
+            </w:pPr>
+          </w:p>
+        </w:tc>
+      </w:tr>
+      <w:tr>
+        <w:tc>
+          <w:tcPr>
+            <w:tcW w:w="1532" w:type="dxa"/>
+          </w:tcPr>
+          <w:p>
+            <w:pPr>
+              <w:rPr>
+                <w:b/>
+                <w:bCs/>
+              </w:rPr>
+            </w:pPr>
+            <w:r>
+              <w:rPr>
+                <w:sz w:val="18"/>
+                <w:szCs w:val="18"/>
+              </w:rPr>
+              <w:t>{</w:t>
+            </w:r>
+            <w:r>
+              <w:rPr>
+                <w:sz w:val="18"/>
+                <w:szCs w:val="18"/>
+              </w:rPr>
+              <w:t>service_name</w:t>
+            </w:r>
+            <w:r>
+              <w:rPr>
+                <w:sz w:val="18"/>
+                <w:szCs w:val="18"/>
+              </w:rPr>
+              <w:t>2}</w:t>
+            </w:r>
+          </w:p>
+        </w:tc>
+        <w:tc>
+          <w:tcPr>
+            <w:tcW w:w="2856" w:type="dxa"/>
+          </w:tcPr>
+          <w:p>
+            <w:pPr>
+              <w:rPr>
+                <w:sz w:val="18"/>
+                <w:szCs w:val="18"/>
+              </w:rPr>
+            </w:pPr>
+            <w:r>
+              <w:rPr>
+                <w:sz w:val="18"/>
+                <w:szCs w:val="18"/>
+              </w:rPr>
+              <w:t>{service_summary_negative2}</w:t>
+            </w:r>
+          </w:p>
+          <w:p>
+            <w:pPr>
+              <w:rPr>
+                <w:b/>
+                <w:bCs/>
+                <w:sz w:val="18"/>
+                <w:szCs w:val="18"/>
+              </w:rPr>
+            </w:pPr>
+          </w:p>
+        </w:tc>
+        <w:tc>
+          <w:tcPr>
+            <w:tcW w:w="2481" w:type="dxa"/>
+          </w:tcPr>
+          <w:p>
+            <w:pPr>
+              <w:rPr>
+                <w:sz w:val="18"/>
+                <w:szCs w:val="18"/>
+              </w:rPr>
+            </w:pPr>
+            <w:r>
+              <w:rPr>
+                <w:sz w:val="18"/>
+                <w:szCs w:val="18"/>
+              </w:rPr>
+              <w:t>{service_summary_neutral2}</w:t>
+            </w:r>
+          </w:p>
+          <w:p>
+            <w:pPr>
+              <w:rPr>
+                <w:b/>
+                <w:bCs/>
+                <w:sz w:val="18"/>
+                <w:szCs w:val="18"/>
+              </w:rPr>
+            </w:pPr>
+          </w:p>
+        </w:tc>
+        <w:tc>
+          <w:tcPr>
+            <w:tcW w:w="2481" w:type="dxa"/>
+          </w:tcPr>
+          <w:p>
+            <w:pPr>
+              <w:rPr>
+                <w:sz w:val="18"/>
+                <w:szCs w:val="18"/>
+              </w:rPr>
+            </w:pPr>
+            <w:r>
+              <w:rPr>
+                <w:sz w:val="18"/>
+                <w:szCs w:val="18"/>
+              </w:rPr>
+              <w:t>{service_summary_positive2}</w:t>
+            </w:r>
+          </w:p>
+          <w:p>
+            <w:pPr>
+              <w:rPr>
+                <w:b/>
+                <w:bCs/>
+                <w:sz w:val="18"/>
+                <w:szCs w:val="18"/>
+              </w:rPr>
+            </w:pPr>
+          </w:p>
+        </w:tc>
+      </w:tr>
+      <w:tr>
+        <w:tc>
+          <w:tcPr>
+            <w:tcW w:w="1532" w:type="dxa"/>
+          </w:tcPr>
+          <w:p>
+            <w:pPr>
+              <w:rPr>
+                <w:b/>
+                <w:bCs/>
+              </w:rPr>
+            </w:pPr>
+            <w:r>
+              <w:rPr>
+                <w:sz w:val="18"/>
+                <w:szCs w:val="18"/>
+              </w:rPr>
+              <w:t>{</w:t>
+            </w:r>
+            <w:r>
+              <w:rPr>
+                <w:sz w:val="18"/>
+                <w:szCs w:val="18"/>
+              </w:rPr>
+              <w:t>service_name</w:t>
+            </w:r>
+            <w:r>
+              <w:rPr>
+                <w:sz w:val="18"/>
+                <w:szCs w:val="18"/>
+              </w:rPr>
+              <w:t>3}</w:t>
+            </w:r>
+          </w:p>
+        </w:tc>
+        <w:tc>
+          <w:tcPr>
+            <w:tcW w:w="2856" w:type="dxa"/>
+          </w:tcPr>
+          <w:p>
+            <w:pPr>
+              <w:rPr>
+                <w:sz w:val="18"/>
+                <w:szCs w:val="18"/>
+              </w:rPr>
+            </w:pPr>
+            <w:r>
+              <w:rPr>
+                <w:sz w:val="18"/>
+                <w:szCs w:val="18"/>
+              </w:rPr>
+              <w:t>{service_summary_negative3}</w:t>
+            </w:r>
+          </w:p>
+          <w:p>
+            <w:pPr>
+              <w:rPr>
+                <w:b/>
+                <w:bCs/>
+                <w:sz w:val="18"/>
+                <w:szCs w:val="18"/>
+              </w:rPr>
+            </w:pPr>
+          </w:p>
+        </w:tc>
+        <w:tc>
+          <w:tcPr>
+            <w:tcW w:w="2481" w:type="dxa"/>
+          </w:tcPr>
+          <w:p>
+            <w:pPr>
+              <w:rPr>
+                <w:sz w:val="18"/>
+                <w:szCs w:val="18"/>
+              </w:rPr>
+            </w:pPr>
+            <w:r>
+              <w:rPr>
+                <w:sz w:val="18"/>
+                <w:szCs w:val="18"/>
+              </w:rPr>
+              <w:t>{service_summary_neutral3}</w:t>
+            </w:r>
+          </w:p>
+          <w:p>
+            <w:pPr>
+              <w:rPr>
+                <w:b/>
+                <w:bCs/>
+                <w:sz w:val="18"/>
+                <w:szCs w:val="18"/>
+              </w:rPr>
+            </w:pPr>
+          </w:p>
+        </w:tc>
+        <w:tc>
+          <w:tcPr>
+            <w:tcW w:w="2481" w:type="dxa"/>
+          </w:tcPr>
+          <w:p>
+            <w:pPr>
+              <w:rPr>
+                <w:sz w:val="18"/>
+                <w:szCs w:val="18"/>
+              </w:rPr>
+            </w:pPr>
+            <w:r>
+              <w:rPr>
+                <w:sz w:val="18"/>
+                <w:szCs w:val="18"/>
+              </w:rPr>
+              <w:t>{service_summary_positive3}</w:t>
+            </w:r>
+          </w:p>
+          <w:p>
+            <w:pPr>
+              <w:rPr>
+                <w:b/>
+                <w:bCs/>
+                <w:sz w:val="18"/>
+                <w:szCs w:val="18"/>
+              </w:rPr>
+            </w:pPr>
+          </w:p>
+        </w:tc>
+      </w:tr>
+      <w:tr>
+        <w:tc>
+          <w:tcPr>
+            <w:tcW w:w="1532" w:type="dxa"/>
+          </w:tcPr>
+          <w:p>
+            <w:pPr>
+              <w:rPr>
+                <w:b/>
+                <w:bCs/>
+              </w:rPr>
+            </w:pPr>
+            <w:r>
+              <w:rPr>
+                <w:sz w:val="18"/>
+                <w:szCs w:val="18"/>
+              </w:rPr>
+              <w:t>{</w:t>
+            </w:r>
+            <w:r>
+              <w:rPr>
+                <w:sz w:val="18"/>
+                <w:szCs w:val="18"/>
+              </w:rPr>
+              <w:t>service_name</w:t>
+            </w:r>
+            <w:r>
+              <w:rPr>
+                <w:sz w:val="18"/>
+                <w:szCs w:val="18"/>
+              </w:rPr>
+              <w:t>4}</w:t>
+            </w:r>
+          </w:p>
+        </w:tc>
+        <w:tc>
+          <w:tcPr>
+            <w:tcW w:w="2856" w:type="dxa"/>
+          </w:tcPr>
+          <w:p>
+            <w:pPr>
+              <w:rPr>
+                <w:sz w:val="18"/>
+                <w:szCs w:val="18"/>
+              </w:rPr>
+            </w:pPr>
+            <w:r>
+              <w:rPr>
+                <w:sz w:val="18"/>
+                <w:szCs w:val="18"/>
+              </w:rPr>
+              <w:t>{service_summary_positive</w:t>
+            </w:r>
+            <w:r>
+              <w:rPr>
+                <w:sz w:val="18"/>
+                <w:szCs w:val="18"/>
+              </w:rPr>
+              <w:t>4</w:t>
+            </w:r>
+            <w:r>
+              <w:rPr>
+                <w:sz w:val="18"/>
+                <w:szCs w:val="18"/>
+              </w:rPr>
+              <w:t>}</w:t>
+            </w:r>
+          </w:p>
+          <w:p>
+            <w:pPr>
+              <w:rPr>
+                <w:b/>
+                <w:bCs/>
+                <w:sz w:val="18"/>
+                <w:szCs w:val="18"/>
+              </w:rPr>
+            </w:pPr>
+          </w:p>
+        </w:tc>
+        <w:tc>
+          <w:tcPr>
+            <w:tcW w:w="2481" w:type="dxa"/>
+          </w:tcPr>
+          <w:p>
+            <w:pPr>
+              <w:rPr>
+                <w:sz w:val="18"/>
+                <w:szCs w:val="18"/>
+              </w:rPr>
+            </w:pPr>
+            <w:r>
+              <w:rPr>
+                <w:sz w:val="18"/>
+                <w:szCs w:val="18"/>
+              </w:rPr>
+              <w:t>{service_summary_positive</w:t>
+            </w:r>
+            <w:r>
+              <w:rPr>
+                <w:sz w:val="18"/>
+                <w:szCs w:val="18"/>
+              </w:rPr>
+              <w:t>4</w:t>
+            </w:r>
+            <w:r>
+              <w:rPr>
+                <w:sz w:val="18"/>
+                <w:szCs w:val="18"/>
+              </w:rPr>
+              <w:t>}</w:t>
+            </w:r>
+          </w:p>
+          <w:p>
+            <w:pPr>
+              <w:rPr>
+                <w:b/>
+                <w:bCs/>
+                <w:sz w:val="18"/>
+                <w:szCs w:val="18"/>
+              </w:rPr>
+            </w:pPr>
+          </w:p>
+        </w:tc>
+        <w:tc>
+          <w:tcPr>
+            <w:tcW w:w="2481" w:type="dxa"/>
+          </w:tcPr>
+          <w:p>
+            <w:pPr>
+              <w:rPr>
+                <w:sz w:val="18"/>
+                <w:szCs w:val="18"/>
+              </w:rPr>
+            </w:pPr>
+            <w:r>
+              <w:rPr>
+                <w:sz w:val="18"/>
+                <w:szCs w:val="18"/>
+              </w:rPr>
+              <w:t>{service_summary_positive</w:t>
+            </w:r>
+            <w:r>
+              <w:rPr>
+                <w:sz w:val="18"/>
+                <w:szCs w:val="18"/>
+              </w:rPr>
+              <w:t>4</w:t>
+            </w:r>
+            <w:r>
+              <w:rPr>
+                <w:sz w:val="18"/>
+                <w:szCs w:val="18"/>
+              </w:rPr>
+              <w:t>}</w:t>
+            </w:r>
+          </w:p>
+          <w:p>
+            <w:pPr>
+              <w:rPr>
+                <w:b/>
+                <w:bCs/>
+                <w:sz w:val="18"/>
+                <w:szCs w:val="18"/>
+              </w:rPr>
+            </w:pPr>
+          </w:p>
+        </w:tc>
+      </w:tr>
+    </w:tbl>
+    <w:p>
+      <w:pPr>
+        <w:rPr>
+          <w:b/>
+          <w:bCs/>
+        </w:rPr>
+      </w:pPr>
+    </w:p>
+    <w:p>
+      <w:pPr>
+        <w:rPr>
+          <w:b/>
+          <w:bCs/>
+        </w:rPr>
+      </w:pPr>
+      <w:r>
+        <w:rPr>
+          <w:b/>
+          <w:bCs/>
+        </w:rPr>
         <w:t>Thematic Analysis of Suggested Improvements</w:t>
       </w:r>
     </w:p>
+    <w:tbl>
+      <w:tblPr>
+        <w:tblStyle w:val="TableGrid"/>
+        <w:tblW w:w="0" w:type="auto"/>
+        <w:tblLook w:val="04A0" w:firstRow="1" w:lastRow="0" w:firstColumn="1" w:lastColumn="0" w:noHBand="0" w:noVBand="1"/>
+      </w:tblPr>
+      <w:tblGrid>
+        <w:gridCol w:w="4675"/>
+        <w:gridCol w:w="4675"/>
+      </w:tblGrid>
+      <w:tr>
+        <w:trPr>
+          <w:trHeight w:val="483"/>
+        </w:trPr>
+        <w:tc>
+          <w:tcPr>
+            <w:tcW w:w="4675" w:type="dxa"/>
+          </w:tcPr>
+          <w:p>
+            <w:pPr>
+              <w:spacing w:line="276" w:lineRule="auto"/>
+              <w:rPr>
+                <w:b/>
+                <w:bCs/>
+                <w:sz w:val="18"/>
+                <w:szCs w:val="18"/>
+              </w:rPr>
+            </w:pPr>
+            <w:r>
+              <w:rPr>
+                <w:sz w:val="18"/>
+                <w:szCs w:val="18"/>
+              </w:rPr>
+              <w:t>{theme_name1}</w:t>
+            </w:r>
+          </w:p>
+        </w:tc>
+        <w:tc>
+          <w:tcPr>
+            <w:tcW w:w="4675" w:type="dxa"/>
+          </w:tcPr>
+          <w:p>
+            <w:pPr>
+              <w:spacing w:line="276" w:lineRule="auto"/>
+              <w:rPr>
+                <w:b/>
+                <w:bCs/>
+                <w:sz w:val="18"/>
+                <w:szCs w:val="18"/>
+              </w:rPr>
+            </w:pPr>
+            <w:r>
+              <w:rPr>
+                <w:sz w:val="18"/>
+                <w:szCs w:val="18"/>
+              </w:rPr>
+              <w:t>{theme_percentage</w:t>
+            </w:r>
+            <w:r>
+              <w:rPr>
+                <w:sz w:val="18"/>
+                <w:szCs w:val="18"/>
+              </w:rPr>
+              <w:t>1</w:t>
+            </w:r>
+            <w:r>
+              <w:rPr>
+                <w:sz w:val="18"/>
+                <w:szCs w:val="18"/>
+              </w:rPr>
+              <w:t>}%</w:t>
+            </w:r>
+          </w:p>
+        </w:tc>
+      </w:tr>
+      <w:tr>
+        <w:trPr>
+          <w:trHeight w:val="419"/>
+        </w:trPr>
+        <w:tc>
+          <w:tcPr>
+            <w:tcW w:w="4675" w:type="dxa"/>
+          </w:tcPr>
+          <w:p>
+            <w:pPr>
+              <w:spacing w:line="276" w:lineRule="auto"/>
+              <w:rPr>
+                <w:b/>
+                <w:bCs/>
+                <w:sz w:val="18"/>
+                <w:szCs w:val="18"/>
+              </w:rPr>
+            </w:pPr>
+            <w:r>
+              <w:rPr>
+                <w:sz w:val="18"/>
+                <w:szCs w:val="18"/>
+              </w:rPr>
+              <w:t>{theme_name2}</w:t>
+            </w:r>
+          </w:p>
+        </w:tc>
+        <w:tc>
+          <w:tcPr>
+            <w:tcW w:w="4675" w:type="dxa"/>
+          </w:tcPr>
+          <w:p>
+            <w:pPr>
+              <w:spacing w:line="276" w:lineRule="auto"/>
+              <w:rPr>
+                <w:b/>
+                <w:bCs/>
+                <w:sz w:val="18"/>
+                <w:szCs w:val="18"/>
+              </w:rPr>
+            </w:pPr>
+            <w:r>
+              <w:rPr>
+                <w:sz w:val="18"/>
+                <w:szCs w:val="18"/>
+              </w:rPr>
+              <w:t>{theme_percentage</w:t>
+            </w:r>
+            <w:r>
+              <w:rPr>
+                <w:sz w:val="18"/>
+                <w:szCs w:val="18"/>
+              </w:rPr>
+              <w:t>2</w:t>
+            </w:r>
+            <w:r>
+              <w:rPr>
+                <w:sz w:val="18"/>
+                <w:szCs w:val="18"/>
+              </w:rPr>
+              <w:t>}%</w:t>
+            </w:r>
+          </w:p>
+        </w:tc>
+      </w:tr>
+      <w:tr>
+        <w:trPr>
+          <w:trHeight w:val="424"/>
+        </w:trPr>
+        <w:tc>
+          <w:tcPr>
+            <w:tcW w:w="4675" w:type="dxa"/>
+          </w:tcPr>
+          <w:p>
+            <w:pPr>
+              <w:spacing w:line="276" w:lineRule="auto"/>
+              <w:rPr>
+                <w:b/>
+                <w:bCs/>
+                <w:sz w:val="18"/>
+                <w:szCs w:val="18"/>
+              </w:rPr>
+            </w:pPr>
+            <w:r>
+              <w:rPr>
+                <w:sz w:val="18"/>
+                <w:szCs w:val="18"/>
+              </w:rPr>
+              <w:t xml:space="preserve">{theme_name3} </w:t>
+            </w:r>
+          </w:p>
+        </w:tc>
+        <w:tc>
+          <w:tcPr>
+            <w:tcW w:w="4675" w:type="dxa"/>
+          </w:tcPr>
+          <w:p>
+            <w:pPr>
+              <w:spacing w:line="276" w:lineRule="auto"/>
+              <w:rPr>
+                <w:b/>
+                <w:bCs/>
+                <w:sz w:val="18"/>
+                <w:szCs w:val="18"/>
+              </w:rPr>
+            </w:pPr>
+            <w:r>
+              <w:rPr>
+                <w:sz w:val="18"/>
+                <w:szCs w:val="18"/>
+              </w:rPr>
+              <w:t>{theme_percentage3}%</w:t>
+            </w:r>
+          </w:p>
+        </w:tc>
+      </w:tr>
+      <w:tr>
+        <w:trPr>
+          <w:trHeight w:val="402"/>
+        </w:trPr>
+        <w:tc>
+          <w:tcPr>
+            <w:tcW w:w="4675" w:type="dxa"/>
+          </w:tcPr>
+          <w:p>
+            <w:pPr>
+              <w:spacing w:line="276" w:lineRule="auto"/>
+              <w:rPr>
+                <w:b/>
+                <w:bCs/>
+                <w:sz w:val="18"/>
+                <w:szCs w:val="18"/>
+              </w:rPr>
+            </w:pPr>
+            <w:r>
+              <w:rPr>
+                <w:sz w:val="18"/>
+                <w:szCs w:val="18"/>
+              </w:rPr>
+              <w:t xml:space="preserve">{theme_name4} </w:t>
+            </w:r>
+          </w:p>
+        </w:tc>
+        <w:tc>
+          <w:tcPr>
+            <w:tcW w:w="4675" w:type="dxa"/>
+          </w:tcPr>
+          <w:p>
+            <w:pPr>
+              <w:spacing w:line="276" w:lineRule="auto"/>
+              <w:rPr>
+                <w:b/>
+                <w:bCs/>
+                <w:sz w:val="18"/>
+                <w:szCs w:val="18"/>
+              </w:rPr>
+            </w:pPr>
+            <w:r>
+              <w:rPr>
+                <w:sz w:val="18"/>
+                <w:szCs w:val="18"/>
+              </w:rPr>
+              <w:t>{theme_percentage4}%</w:t>
+            </w:r>
+          </w:p>
+        </w:tc>
+      </w:tr>
+      <w:tr>
+        <w:trPr>
+          <w:trHeight w:val="461"/>
+        </w:trPr>
+        <w:tc>
+          <w:tcPr>
+            <w:tcW w:w="4675" w:type="dxa"/>
+          </w:tcPr>
+          <w:p>
+            <w:pPr>
+              <w:spacing w:line="276" w:lineRule="auto"/>
+              <w:rPr>
+                <w:b/>
+                <w:bCs/>
+                <w:sz w:val="18"/>
+                <w:szCs w:val="18"/>
+              </w:rPr>
+            </w:pPr>
+            <w:r>
+              <w:rPr>
+                <w:sz w:val="18"/>
+                <w:szCs w:val="18"/>
+              </w:rPr>
+              <w:t xml:space="preserve">{theme_name5} </w:t>
+            </w:r>
+          </w:p>
+        </w:tc>
+        <w:tc>
+          <w:tcPr>
+            <w:tcW w:w="4675" w:type="dxa"/>
+          </w:tcPr>
+          <w:p>
+            <w:pPr>
+              <w:spacing w:line="276" w:lineRule="auto"/>
+              <w:rPr>
+                <w:b/>
+                <w:bCs/>
+                <w:sz w:val="18"/>
+                <w:szCs w:val="18"/>
+              </w:rPr>
+            </w:pPr>
+            <w:r>
+              <w:rPr>
+                <w:sz w:val="18"/>
+                <w:szCs w:val="18"/>
+              </w:rPr>
+              <w:t>{theme_percentage5}%</w:t>
+            </w:r>
+          </w:p>
+        </w:tc>
+      </w:tr>
+      <w:tr>
+        <w:trPr>
+          <w:trHeight w:val="425"/>
+        </w:trPr>
+        <w:tc>
+          <w:tcPr>
+            <w:tcW w:w="4675" w:type="dxa"/>
+          </w:tcPr>
+          <w:p>
+            <w:pPr>
+              <w:spacing w:line="276" w:lineRule="auto"/>
+              <w:rPr>
+                <w:b/>
+                <w:bCs/>
+                <w:sz w:val="18"/>
+                <w:szCs w:val="18"/>
+              </w:rPr>
+            </w:pPr>
+            <w:r>
+              <w:rPr>
+                <w:sz w:val="18"/>
+                <w:szCs w:val="18"/>
+              </w:rPr>
+              <w:t xml:space="preserve">{theme_name6} </w:t>
+            </w:r>
+          </w:p>
+        </w:tc>
+        <w:tc>
+          <w:tcPr>
+            <w:tcW w:w="4675" w:type="dxa"/>
+          </w:tcPr>
+          <w:p>
+            <w:pPr>
+              <w:spacing w:line="276" w:lineRule="auto"/>
+              <w:rPr>
+                <w:b/>
+                <w:bCs/>
+                <w:sz w:val="18"/>
+                <w:szCs w:val="18"/>
+              </w:rPr>
+            </w:pPr>
+            <w:r>
+              <w:rPr>
+                <w:sz w:val="18"/>
+                <w:szCs w:val="18"/>
+              </w:rPr>
+              <w:t>{theme_percentage6}%</w:t>
+            </w:r>
+          </w:p>
+        </w:tc>
+      </w:tr>
+    </w:tbl>
     <w:p>
       <w:pPr>
-        <w:pStyle w:val="ListParagraph"/>
-        <w:numPr>
-          <w:ilvl w:val="0"/>
-          <w:numId w:val="5"/>
-        </w:numPr>
-      </w:pPr>
-      <w:r>
-        <w:t>Internet Infrastructure 34% - 34 counts</w:t>
-      </w:r>
+        <w:rPr>
+          <w:b/>
+          <w:bCs/>
+        </w:rPr>
+      </w:pPr>
     </w:p>
-    <w:p>
-      <w:pPr>
-        <w:pStyle w:val="ListParagraph"/>
-        <w:numPr>
-          <w:ilvl w:val="1"/>
-          <w:numId w:val="5"/>
-        </w:numPr>
-      </w:pPr>
-      <w:r>
-        <w:t>Most common keywords: internet, intranet infrastructure</w:t>
-      </w:r>
-    </w:p>
-    <w:p>
-      <w:pPr>
-        <w:pStyle w:val="ListParagraph"/>
-        <w:ind w:left="1440"/>
-      </w:pPr>
-    </w:p>
-    <w:p>
-      <w:pPr>
-        <w:pStyle w:val="ListParagraph"/>
-        <w:numPr>
-          <w:ilvl w:val="0"/>
-          <w:numId w:val="6"/>
-        </w:numPr>
-        <w:rPr>
-          <w:noProof/>
-        </w:rPr>
-      </w:pPr>
-      <w:r>
-        <w:rPr>
-          <w:noProof/>
-        </w:rPr>
-        <w:t>Digital Literacy: 25% - 25 counts</w:t>
-      </w:r>
-    </w:p>
-    <w:p>
-      <w:pPr>
-        <w:pStyle w:val="ListParagraph"/>
-        <w:numPr>
-          <w:ilvl w:val="1"/>
-          <w:numId w:val="5"/>
-        </w:numPr>
-        <w:rPr>
-          <w:noProof/>
-        </w:rPr>
-      </w:pPr>
-      <w:r>
-        <w:t>Most common keywords</w:t>
-      </w:r>
-      <w:r>
-        <w:rPr>
-          <w:noProof/>
-        </w:rPr>
-        <w:t>: illiteracy unaware digital confusion</w:t>
-      </w:r>
-    </w:p>
-    <w:p>
-      <w:pPr>
-        <w:pStyle w:val="ListParagraph"/>
-        <w:ind w:left="1440"/>
-        <w:rPr>
-          <w:noProof/>
-        </w:rPr>
-      </w:pPr>
-    </w:p>
-    <w:p>
-      <w:pPr>
-        <w:pStyle w:val="ListParagraph"/>
-        <w:numPr>
-          <w:ilvl w:val="0"/>
-          <w:numId w:val="7"/>
-        </w:numPr>
-        <w:rPr>
-          <w:noProof/>
-        </w:rPr>
-      </w:pPr>
-      <w:r>
-        <w:rPr>
-          <w:noProof/>
-        </w:rPr>
-        <w:t>Cost Of Technology: 17% - 17 counts</w:t>
-      </w:r>
-    </w:p>
-    <w:p>
-      <w:pPr>
-        <w:pStyle w:val="ListParagraph"/>
-        <w:numPr>
-          <w:ilvl w:val="1"/>
-          <w:numId w:val="5"/>
-        </w:numPr>
-        <w:rPr>
-          <w:noProof/>
-        </w:rPr>
-      </w:pPr>
-      <w:r>
-        <w:t>Most common keywords</w:t>
-      </w:r>
-      <w:r>
-        <w:rPr>
-          <w:noProof/>
-        </w:rPr>
-        <w:t>: technology pricey unaffordable expensive</w:t>
-      </w:r>
-    </w:p>
-    <w:p>
-      <w:pPr>
-        <w:pStyle w:val="ListParagraph"/>
-        <w:ind w:left="1440"/>
-        <w:rPr>
-          <w:noProof/>
-        </w:rPr>
-      </w:pPr>
-    </w:p>
-    <w:p>
-      <w:pPr>
-        <w:pStyle w:val="ListParagraph"/>
-        <w:numPr>
-          <w:ilvl w:val="0"/>
-          <w:numId w:val="8"/>
-        </w:numPr>
-        <w:rPr>
-          <w:noProof/>
-        </w:rPr>
-      </w:pPr>
-      <w:r>
-        <w:rPr>
-          <w:noProof/>
-        </w:rPr>
-        <w:t>Cloud complexity: 13% - 13 counts</w:t>
-      </w:r>
-    </w:p>
-    <w:p>
-      <w:pPr>
-        <w:pStyle w:val="ListParagraph"/>
-        <w:numPr>
-          <w:ilvl w:val="1"/>
-          <w:numId w:val="5"/>
-        </w:numPr>
-        <w:rPr>
-          <w:noProof/>
-        </w:rPr>
-      </w:pPr>
-      <w:r>
-        <w:t>Most common keywords</w:t>
-      </w:r>
-      <w:r>
-        <w:rPr>
-          <w:noProof/>
-        </w:rPr>
-        <w:t>: cloud hard topic vpc confusion</w:t>
-      </w:r>
-    </w:p>
-    <w:p>
-      <w:pPr>
-        <w:pStyle w:val="ListParagraph"/>
-        <w:ind w:left="1440"/>
-        <w:rPr>
-          <w:noProof/>
-        </w:rPr>
-      </w:pPr>
-    </w:p>
-    <w:p>
-      <w:pPr>
-        <w:pStyle w:val="ListParagraph"/>
-        <w:numPr>
-          <w:ilvl w:val="0"/>
-          <w:numId w:val="9"/>
-        </w:numPr>
-        <w:rPr>
-          <w:noProof/>
-        </w:rPr>
-      </w:pPr>
-      <w:r>
-        <w:rPr>
-          <w:noProof/>
-        </w:rPr>
-        <w:t>Inclusivity and Access: 11% - 11 counts</w:t>
-      </w:r>
-    </w:p>
-    <w:p>
-      <w:pPr>
-        <w:pStyle w:val="ListParagraph"/>
-        <w:numPr>
-          <w:ilvl w:val="1"/>
-          <w:numId w:val="5"/>
-        </w:numPr>
-      </w:pPr>
-      <w:r>
-        <w:t>Most common keywords</w:t>
-      </w:r>
-      <w:r>
-        <w:rPr>
-          <w:noProof/>
-        </w:rPr>
-        <w:t>: elderly impaired disability braille</w:t>
-      </w:r>
-    </w:p>
+    <w:p/>
     <w:sectPr>
       <w:pgSz w:w="12240" w:h="15840"/>
       <w:pgMar w:top="1440" w:right="1440" w:bottom="1440" w:left="1440" w:header="708" w:footer="708" w:gutter="0"/>
@@ -2383,7 +3197,7 @@
 </file>
 
 <file path=word/numbering.xml><?xml version="1.0" encoding="utf-8"?>
-<w:numbering xmlns:wpc="http://schemas.microsoft.com/office/word/2010/wordprocessingCanvas" xmlns:cx="http://schemas.microsoft.com/office/drawing/2014/chartex" xmlns:cx1="http://schemas.microsoft.com/office/drawing/2015/9/8/chartex" xmlns:cx2="http://schemas.microsoft.com/office/drawing/2015/10/21/chartex" xmlns:cx3="http://schemas.microsoft.com/office/drawing/2016/5/9/chartex" xmlns:cx4="http://schemas.microsoft.com/office/drawing/2016/5/10/chartex" xmlns:cx5="http://schemas.microsoft.com/office/drawing/2016/5/11/chartex" xmlns:cx6="http://schemas.microsoft.com/office/drawing/2016/5/12/chartex" xmlns:cx7="http://schemas.microsoft.com/office/drawing/2016/5/13/chartex" xmlns:cx8="http://schemas.microsoft.com/office/drawing/2016/5/14/chartex" xmlns:mc="http://schemas.openxmlformats.org/markup-compatibility/2006" xmlns:aink="http://schemas.microsoft.com/office/drawing/2016/ink" xmlns:am3d="http://schemas.microsoft.com/office/drawing/2017/model3d" xmlns:o="urn:schemas-microsoft-com:office:office" xmlns:oel="http://schemas.microsoft.com/office/2019/extlst" xmlns:r="http://schemas.openxmlformats.org/officeDocument/2006/relationships" xmlns:m="http://schemas.openxmlformats.org/officeDocument/2006/math" xmlns:v="urn:schemas-microsoft-com:vml" xmlns:wp14="http://schemas.microsoft.com/office/word/2010/wordprocessingDrawing" xmlns:wp="http://schemas.openxmlformats.org/drawingml/2006/wordprocessingDrawing" xmlns:w10="urn:schemas-microsoft-com:office:word" xmlns:w="http://schemas.openxmlformats.org/wordprocessingml/2006/main" xmlns:w14="http://schemas.microsoft.com/office/word/2010/wordml" xmlns:w15="http://schemas.microsoft.com/office/word/2012/wordml" xmlns:w16cex="http://schemas.microsoft.com/office/word/2018/wordml/cex" xmlns:w16cid="http://schemas.microsoft.com/office/word/2016/wordml/cid" xmlns:w16="http://schemas.microsoft.com/office/word/2018/wordml" xmlns:w16du="http://schemas.microsoft.com/office/word/2023/wordml/word16du" xmlns:w16sdtdh="http://schemas.microsoft.com/office/word/2020/wordml/sdtdatahash" xmlns:w16sdtfl="http://schemas.microsoft.com/office/word/2024/wordml/sdtformatlock" xmlns:w16se="http://schemas.microsoft.com/office/word/2015/wordml/symex" xmlns:wpg="http://schemas.microsoft.com/office/word/2010/wordprocessingGroup" xmlns:wpi="http://schemas.microsoft.com/office/word/2010/wordprocessingInk" xmlns:wne="http://schemas.microsoft.com/office/word/2006/wordml" xmlns:wps="http://schemas.microsoft.com/office/word/2010/wordprocessingShape" mc:Ignorable="w14 w15 w16se w16cid w16 w16cex w16sdtdh w16sdtfl w16du wp14">
+<w:numbering xmlns:wpc="http://schemas.microsoft.com/office/word/2010/wordprocessingCanvas" xmlns:cx="http://schemas.microsoft.com/office/drawing/2014/chartex" xmlns:cx1="http://schemas.microsoft.com/office/drawing/2015/9/8/chartex" xmlns:cx2="http://schemas.microsoft.com/office/drawing/2015/10/21/chartex" xmlns:cx3="http://schemas.microsoft.com/office/drawing/2016/5/9/chartex" xmlns:cx4="http://schemas.microsoft.com/office/drawing/2016/5/10/chartex" xmlns:cx5="http://schemas.microsoft.com/office/drawing/2016/5/11/chartex" xmlns:cx6="http://schemas.microsoft.com/office/drawing/2016/5/12/chartex" xmlns:cx7="http://schemas.microsoft.com/office/drawing/2016/5/13/chartex" xmlns:cx8="http://schemas.microsoft.com/office/drawing/2016/5/14/chartex" xmlns:mc="http://schemas.openxmlformats.org/markup-compatibility/2006" xmlns:m="http://schemas.openxmlformats.org/officeDocument/2006/math" xmlns:aink="http://schemas.microsoft.com/office/drawing/2016/ink" xmlns:am3d="http://schemas.microsoft.com/office/drawing/2017/model3d" xmlns:oel="http://schemas.microsoft.com/office/2019/extlst" xmlns:r="http://schemas.openxmlformats.org/officeDocument/2006/relationships" xmlns:wp14="http://schemas.microsoft.com/office/word/2010/wordprocessingDrawing" xmlns:wp="http://schemas.openxmlformats.org/drawingml/2006/wordprocessingDrawing" xmlns:wpg="http://schemas.microsoft.com/office/word/2010/wordprocessingGroup" xmlns:wpi="http://schemas.microsoft.com/office/word/2010/wordprocessingInk" xmlns:wps="http://schemas.microsoft.com/office/word/2010/wordprocessingShape" xmlns:o="urn:schemas-microsoft-com:office:office" xmlns:v="urn:schemas-microsoft-com:vml" xmlns:w10="urn:schemas-microsoft-com:office:word" xmlns:w="http://schemas.openxmlformats.org/wordprocessingml/2006/main" xmlns:w14="http://schemas.microsoft.com/office/word/2010/wordml" xmlns:w15="http://schemas.microsoft.com/office/word/2012/wordml" xmlns:w16cex="http://schemas.microsoft.com/office/word/2018/wordml/cex" xmlns:w16cid="http://schemas.microsoft.com/office/word/2016/wordml/cid" xmlns:w16="http://schemas.microsoft.com/office/word/2018/wordml" xmlns:w16sdtdh="http://schemas.microsoft.com/office/word/2020/wordml/sdtdatahash" xmlns:w16sdtfl="http://schemas.microsoft.com/office/word/2024/wordml/sdtformatlock" xmlns:w16se="http://schemas.microsoft.com/office/word/2015/wordml/symex" xmlns:w16du="http://schemas.microsoft.com/office/word/2023/wordml/word16du" xmlns:wne="http://schemas.microsoft.com/office/word/2006/wordml" mc:Ignorable="w14 w15 w16se w16cid w16 w16cex w16sdtdh w16sdtfl w16du wp14">
   <w:abstractNum w:abstractNumId="0" w15:restartNumberingAfterBreak="0">
     <w:nsid w:val="07380F92"/>
     <w:multiLevelType w:val="hybridMultilevel"/>
@@ -3432,7 +4246,7 @@
 </file>
 
 <file path=word/styles.xml><?xml version="1.0" encoding="utf-8"?>
-<w:styles xmlns:mc="http://schemas.openxmlformats.org/markup-compatibility/2006" xmlns:r="http://schemas.openxmlformats.org/officeDocument/2006/relationships" xmlns:w="http://schemas.openxmlformats.org/wordprocessingml/2006/main" xmlns:w14="http://schemas.microsoft.com/office/word/2010/wordml" xmlns:w15="http://schemas.microsoft.com/office/word/2012/wordml" xmlns:w16cex="http://schemas.microsoft.com/office/word/2018/wordml/cex" xmlns:w16cid="http://schemas.microsoft.com/office/word/2016/wordml/cid" xmlns:w16="http://schemas.microsoft.com/office/word/2018/wordml" xmlns:w16du="http://schemas.microsoft.com/office/word/2023/wordml/word16du" xmlns:w16sdtdh="http://schemas.microsoft.com/office/word/2020/wordml/sdtdatahash" xmlns:w16sdtfl="http://schemas.microsoft.com/office/word/2024/wordml/sdtformatlock" xmlns:w16se="http://schemas.microsoft.com/office/word/2015/wordml/symex" mc:Ignorable="w14 w15 w16se w16cid w16 w16cex w16sdtdh w16sdtfl w16du">
+<w:styles xmlns:mc="http://schemas.openxmlformats.org/markup-compatibility/2006" xmlns:r="http://schemas.openxmlformats.org/officeDocument/2006/relationships" xmlns:w="http://schemas.openxmlformats.org/wordprocessingml/2006/main" xmlns:w14="http://schemas.microsoft.com/office/word/2010/wordml" xmlns:w15="http://schemas.microsoft.com/office/word/2012/wordml" xmlns:w16cex="http://schemas.microsoft.com/office/word/2018/wordml/cex" xmlns:w16cid="http://schemas.microsoft.com/office/word/2016/wordml/cid" xmlns:w16="http://schemas.microsoft.com/office/word/2018/wordml" xmlns:w16sdtdh="http://schemas.microsoft.com/office/word/2020/wordml/sdtdatahash" xmlns:w16sdtfl="http://schemas.microsoft.com/office/word/2024/wordml/sdtformatlock" xmlns:w16se="http://schemas.microsoft.com/office/word/2015/wordml/symex" xmlns:w16du="http://schemas.microsoft.com/office/word/2023/wordml/word16du" mc:Ignorable="w14 w15 w16se w16cid w16 w16cex w16sdtdh w16sdtfl w16du">
   <w:docDefaults>
     <w:rPrDefault>
       <w:rPr>
@@ -4035,6 +4849,7 @@
   <w:style w:type="character" w:default="1" w:styleId="DefaultParagraphFont">
     <w:name w:val="Default Paragraph Font"/>
     <w:uiPriority w:val="1"/>
+    <w:semiHidden/>
     <w:unhideWhenUsed/>
   </w:style>
   <w:style w:type="table" w:default="1" w:styleId="TableNormal">

</xml_diff>